<commit_message>
Agrega flujo de CI en la raiz
</commit_message>
<xml_diff>
--- a/Actividad_Pruebas_y_GitHub_Actions.docx
+++ b/Actividad_Pruebas_y_GitHub_Actions.docx
@@ -1,6 +1,6 @@
 
 <file path=word/document.xml><?xml version="1.0" encoding="utf-8"?>
-<w:document xmlns:wpc="http://schemas.microsoft.com/office/word/2010/wordprocessingCanvas" xmlns:cx="http://schemas.microsoft.com/office/drawing/2014/chartex" xmlns:cx1="http://schemas.microsoft.com/office/drawing/2015/9/8/chartex" xmlns:cx2="http://schemas.microsoft.com/office/drawing/2015/10/21/chartex" xmlns:cx3="http://schemas.microsoft.com/office/drawing/2016/5/9/chartex" xmlns:cx4="http://schemas.microsoft.com/office/drawing/2016/5/10/chartex" xmlns:cx5="http://schemas.microsoft.com/office/drawing/2016/5/11/chartex" xmlns:cx6="http://schemas.microsoft.com/office/drawing/2016/5/12/chartex" xmlns:cx7="http://schemas.microsoft.com/office/drawing/2016/5/13/chartex" xmlns:cx8="http://schemas.microsoft.com/office/drawing/2016/5/14/chartex" xmlns:mc="http://schemas.openxmlformats.org/markup-compatibility/2006" xmlns:m="http://schemas.openxmlformats.org/officeDocument/2006/math" xmlns:aink="http://schemas.microsoft.com/office/drawing/2016/ink" xmlns:am3d="http://schemas.microsoft.com/office/drawing/2017/model3d" xmlns:oel="http://schemas.microsoft.com/office/2019/extlst" xmlns:r="http://schemas.openxmlformats.org/officeDocument/2006/relationships" xmlns:wp14="http://schemas.microsoft.com/office/word/2010/wordprocessingDrawing" xmlns:wp="http://schemas.openxmlformats.org/drawingml/2006/wordprocessingDrawing" xmlns:wpg="http://schemas.microsoft.com/office/word/2010/wordprocessingGroup" xmlns:wpi="http://schemas.microsoft.com/office/word/2010/wordprocessingInk" xmlns:wps="http://schemas.microsoft.com/office/word/2010/wordprocessingShape" xmlns:o="urn:schemas-microsoft-com:office:office" xmlns:v="urn:schemas-microsoft-com:vml" xmlns:w10="urn:schemas-microsoft-com:office:word" xmlns:w="http://schemas.openxmlformats.org/wordprocessingml/2006/main" xmlns:w14="http://schemas.microsoft.com/office/word/2010/wordml" xmlns:w15="http://schemas.microsoft.com/office/word/2012/wordml" xmlns:w16cex="http://schemas.microsoft.com/office/word/2018/wordml/cex" xmlns:w16cid="http://schemas.microsoft.com/office/word/2016/wordml/cid" xmlns:w16="http://schemas.microsoft.com/office/word/2018/wordml" xmlns:w16sdtdh="http://schemas.microsoft.com/office/word/2020/wordml/sdtdatahash" xmlns:w16sdtfl="http://schemas.microsoft.com/office/word/2024/wordml/sdtformatlock" xmlns:w16se="http://schemas.microsoft.com/office/word/2015/wordml/symex" xmlns:w16du="http://schemas.microsoft.com/office/word/2023/wordml/word16du" xmlns:wne="http://schemas.microsoft.com/office/word/2006/wordml" mc:Ignorable="w14 w15 w16se w16cid w16 w16cex w16sdtdh w16sdtfl w16du wp14">
+<w:document xmlns:wpc="http://schemas.microsoft.com/office/word/2010/wordprocessingCanvas" xmlns:cx="http://schemas.microsoft.com/office/drawing/2014/chartex" xmlns:cx1="http://schemas.microsoft.com/office/drawing/2015/9/8/chartex" xmlns:cx2="http://schemas.microsoft.com/office/drawing/2015/10/21/chartex" xmlns:cx3="http://schemas.microsoft.com/office/drawing/2016/5/9/chartex" xmlns:cx4="http://schemas.microsoft.com/office/drawing/2016/5/10/chartex" xmlns:cx5="http://schemas.microsoft.com/office/drawing/2016/5/11/chartex" xmlns:cx6="http://schemas.microsoft.com/office/drawing/2016/5/12/chartex" xmlns:cx7="http://schemas.microsoft.com/office/drawing/2016/5/13/chartex" xmlns:cx8="http://schemas.microsoft.com/office/drawing/2016/5/14/chartex" xmlns:mc="http://schemas.openxmlformats.org/markup-compatibility/2006" xmlns:aink="http://schemas.microsoft.com/office/drawing/2016/ink" xmlns:am3d="http://schemas.microsoft.com/office/drawing/2017/model3d" xmlns:o="urn:schemas-microsoft-com:office:office" xmlns:oel="http://schemas.microsoft.com/office/2019/extlst" xmlns:r="http://schemas.openxmlformats.org/officeDocument/2006/relationships" xmlns:m="http://schemas.openxmlformats.org/officeDocument/2006/math" xmlns:v="urn:schemas-microsoft-com:vml" xmlns:wp14="http://schemas.microsoft.com/office/word/2010/wordprocessingDrawing" xmlns:wp="http://schemas.openxmlformats.org/drawingml/2006/wordprocessingDrawing" xmlns:w10="urn:schemas-microsoft-com:office:word" xmlns:w="http://schemas.openxmlformats.org/wordprocessingml/2006/main" xmlns:w14="http://schemas.microsoft.com/office/word/2010/wordml" xmlns:w15="http://schemas.microsoft.com/office/word/2012/wordml" xmlns:w16cex="http://schemas.microsoft.com/office/word/2018/wordml/cex" xmlns:w16cid="http://schemas.microsoft.com/office/word/2016/wordml/cid" xmlns:w16="http://schemas.microsoft.com/office/word/2018/wordml" xmlns:w16du="http://schemas.microsoft.com/office/word/2023/wordml/word16du" xmlns:w16sdtdh="http://schemas.microsoft.com/office/word/2020/wordml/sdtdatahash" xmlns:w16sdtfl="http://schemas.microsoft.com/office/word/2024/wordml/sdtformatlock" xmlns:w16se="http://schemas.microsoft.com/office/word/2015/wordml/symex" xmlns:wpg="http://schemas.microsoft.com/office/word/2010/wordprocessingGroup" xmlns:wpi="http://schemas.microsoft.com/office/word/2010/wordprocessingInk" xmlns:wne="http://schemas.microsoft.com/office/word/2006/wordml" xmlns:wps="http://schemas.microsoft.com/office/word/2010/wordprocessingShape" mc:Ignorable="w14 w15 w16se w16cid w16 w16cex w16sdtdh w16sdtfl w16du wp14">
   <w:body>
     <w:p>
       <w:pPr>
@@ -48,24 +48,14 @@
           <w:sz w:val="32"/>
           <w:lang w:val="es-CO"/>
         </w:rPr>
-        <w:t xml:space="preserve">Automatización con GitHub </w:t>
-      </w:r>
-      <w:proofErr w:type="spellStart"/>
+        <w:t>Automatización con GitHub Actions</w:t>
+      </w:r>
       <w:r>
         <w:rPr>
           <w:color w:val="404040"/>
           <w:sz w:val="32"/>
           <w:lang w:val="es-CO"/>
         </w:rPr>
-        <w:t>Actions</w:t>
-      </w:r>
-      <w:proofErr w:type="spellEnd"/>
-      <w:r>
-        <w:rPr>
-          <w:color w:val="404040"/>
-          <w:sz w:val="32"/>
-          <w:lang w:val="es-CO"/>
-        </w:rPr>
         <w:br/>
       </w:r>
     </w:p>
@@ -95,17 +85,8 @@
           <w:b/>
           <w:lang w:val="es-CO"/>
         </w:rPr>
-        <w:t xml:space="preserve">Proyecto: </w:t>
-      </w:r>
-      <w:proofErr w:type="spellStart"/>
-      <w:r>
-        <w:rPr>
-          <w:b/>
-          <w:lang w:val="es-CO"/>
-        </w:rPr>
-        <w:t>ProyectoEquipos</w:t>
-      </w:r>
-      <w:proofErr w:type="spellEnd"/>
+        <w:t>Proyecto: ProyectoEquipos</w:t>
+      </w:r>
       <w:r>
         <w:rPr>
           <w:b/>
@@ -144,12 +125,10 @@
       <w:pPr>
         <w:pStyle w:val="Ttulo1"/>
       </w:pPr>
-      <w:proofErr w:type="spellStart"/>
       <w:r>
         <w:lastRenderedPageBreak/>
         <w:t>Índice</w:t>
       </w:r>
-      <w:proofErr w:type="spellEnd"/>
     </w:p>
     <w:p>
       <w:pPr>
@@ -267,55 +246,7 @@
         <w:rPr>
           <w:lang w:val="es-CO"/>
         </w:rPr>
-        <w:t>G</w:t>
-      </w:r>
-      <w:r>
-        <w:rPr>
-          <w:lang w:val="es-CO"/>
-        </w:rPr>
-        <w:t xml:space="preserve">estión de errores de </w:t>
-      </w:r>
-      <w:proofErr w:type="spellStart"/>
-      <w:r>
-        <w:rPr>
-          <w:lang w:val="es-CO"/>
-        </w:rPr>
-        <w:t>testing</w:t>
-      </w:r>
-      <w:proofErr w:type="spellEnd"/>
-      <w:r>
-        <w:rPr>
-          <w:lang w:val="es-CO"/>
-        </w:rPr>
-        <w:t xml:space="preserve"> y automatización de procesos de verificación de calidad mediante la implementación de un </w:t>
-      </w:r>
-      <w:proofErr w:type="spellStart"/>
-      <w:r>
-        <w:rPr>
-          <w:lang w:val="es-CO"/>
-        </w:rPr>
-        <w:t>workflow</w:t>
-      </w:r>
-      <w:proofErr w:type="spellEnd"/>
-      <w:r>
-        <w:rPr>
-          <w:lang w:val="es-CO"/>
-        </w:rPr>
-        <w:t xml:space="preserve"> de GitHub </w:t>
-      </w:r>
-      <w:proofErr w:type="spellStart"/>
-      <w:r>
-        <w:rPr>
-          <w:lang w:val="es-CO"/>
-        </w:rPr>
-        <w:t>Actions</w:t>
-      </w:r>
-      <w:proofErr w:type="spellEnd"/>
-      <w:r>
-        <w:rPr>
-          <w:lang w:val="es-CO"/>
-        </w:rPr>
-        <w:t>.</w:t>
+        <w:t>Gestión de errores de testing y automatización de procesos de verificación de calidad mediante la implementación de un workflow de GitHub Actions.</w:t>
       </w:r>
     </w:p>
     <w:p>
@@ -393,35 +324,7 @@
         <w:rPr>
           <w:lang w:val="es-CO"/>
         </w:rPr>
-        <w:t xml:space="preserve">Diseñar e implementar un </w:t>
-      </w:r>
-      <w:proofErr w:type="spellStart"/>
-      <w:r>
-        <w:rPr>
-          <w:lang w:val="es-CO"/>
-        </w:rPr>
-        <w:t>workflow</w:t>
-      </w:r>
-      <w:proofErr w:type="spellEnd"/>
-      <w:r>
-        <w:rPr>
-          <w:lang w:val="es-CO"/>
-        </w:rPr>
-        <w:t xml:space="preserve"> de CI/CD con GitHub </w:t>
-      </w:r>
-      <w:proofErr w:type="spellStart"/>
-      <w:r>
-        <w:rPr>
-          <w:lang w:val="es-CO"/>
-        </w:rPr>
-        <w:t>Actions</w:t>
-      </w:r>
-      <w:proofErr w:type="spellEnd"/>
-      <w:r>
-        <w:rPr>
-          <w:lang w:val="es-CO"/>
-        </w:rPr>
-        <w:t>.</w:t>
+        <w:t>Diseñar e implementar un workflow de CI/CD con GitHub Actions.</w:t>
       </w:r>
     </w:p>
     <w:p>
@@ -490,21 +393,7 @@
         <w:rPr>
           <w:lang w:val="es-CO"/>
         </w:rPr>
-        <w:t xml:space="preserve">Esta actividad práctica está dividida en 4 partes secuenciales que simulan un flujo real de desarrollo de software con énfasis en </w:t>
-      </w:r>
-      <w:proofErr w:type="spellStart"/>
-      <w:r>
-        <w:rPr>
-          <w:lang w:val="es-CO"/>
-        </w:rPr>
-        <w:t>testing</w:t>
-      </w:r>
-      <w:proofErr w:type="spellEnd"/>
-      <w:r>
-        <w:rPr>
-          <w:lang w:val="es-CO"/>
-        </w:rPr>
-        <w:t xml:space="preserve"> y automatización:</w:t>
+        <w:t>Esta actividad práctica está dividida en 4 partes secuenciales que simulan un flujo real de desarrollo de software con énfasis en testing y automatización:</w:t>
       </w:r>
     </w:p>
     <w:p>
@@ -554,11 +443,9 @@
             <w:tcW w:w="4320" w:type="dxa"/>
           </w:tcPr>
           <w:p>
-            <w:proofErr w:type="spellStart"/>
             <w:r>
               <w:t>Parte</w:t>
             </w:r>
-            <w:proofErr w:type="spellEnd"/>
           </w:p>
         </w:tc>
         <w:tc>
@@ -605,21 +492,7 @@
               <w:rPr>
                 <w:lang w:val="es-CO"/>
               </w:rPr>
-              <w:t xml:space="preserve">Clonación y </w:t>
-            </w:r>
-            <w:proofErr w:type="spellStart"/>
-            <w:r>
-              <w:rPr>
-                <w:lang w:val="es-CO"/>
-              </w:rPr>
-              <w:t>Setup</w:t>
-            </w:r>
-            <w:proofErr w:type="spellEnd"/>
-            <w:r>
-              <w:rPr>
-                <w:lang w:val="es-CO"/>
-              </w:rPr>
-              <w:t xml:space="preserve"> del Proyecto (Asistido por Profesor)</w:t>
+              <w:t>Clonación y Setup del Proyecto (Asistido por Profesor)</w:t>
             </w:r>
           </w:p>
         </w:tc>
@@ -634,13 +507,8 @@
             <w:tcW w:w="4320" w:type="dxa"/>
           </w:tcPr>
           <w:p>
-            <w:proofErr w:type="spellStart"/>
             <w:r>
-              <w:t>Parte</w:t>
-            </w:r>
-            <w:proofErr w:type="spellEnd"/>
-            <w:r>
-              <w:t xml:space="preserve"> 2</w:t>
+              <w:t>Parte 2</w:t>
             </w:r>
           </w:p>
         </w:tc>
@@ -674,13 +542,8 @@
             <w:tcW w:w="4320" w:type="dxa"/>
           </w:tcPr>
           <w:p>
-            <w:proofErr w:type="spellStart"/>
             <w:r>
-              <w:t>Parte</w:t>
-            </w:r>
-            <w:proofErr w:type="spellEnd"/>
-            <w:r>
-              <w:t xml:space="preserve"> 3</w:t>
+              <w:t>Parte 3</w:t>
             </w:r>
           </w:p>
         </w:tc>
@@ -714,13 +577,8 @@
             <w:tcW w:w="4320" w:type="dxa"/>
           </w:tcPr>
           <w:p>
-            <w:proofErr w:type="spellStart"/>
             <w:r>
-              <w:t>Parte</w:t>
-            </w:r>
-            <w:proofErr w:type="spellEnd"/>
-            <w:r>
-              <w:t xml:space="preserve"> 4</w:t>
+              <w:t>Parte 4</w:t>
             </w:r>
           </w:p>
         </w:tc>
@@ -833,19 +691,9 @@
       <w:pPr>
         <w:pStyle w:val="Listaconnmeros"/>
       </w:pPr>
-      <w:proofErr w:type="spellStart"/>
-      <w:r>
-        <w:t>Clonar</w:t>
-      </w:r>
-      <w:proofErr w:type="spellEnd"/>
-      <w:r>
-        <w:t xml:space="preserve"> el </w:t>
-      </w:r>
-      <w:proofErr w:type="spellStart"/>
-      <w:r>
-        <w:t>repositorio</w:t>
-      </w:r>
-      <w:proofErr w:type="spellEnd"/>
+      <w:r>
+        <w:t>Clonar el repositorio</w:t>
+      </w:r>
     </w:p>
     <w:p>
       <w:pPr>
@@ -860,58 +708,75 @@
           <w:color w:val="006400"/>
           <w:lang w:val="es-CO"/>
         </w:rPr>
-        <w:t xml:space="preserve">Comando: </w:t>
-      </w:r>
-      <w:proofErr w:type="spellStart"/>
+        <w:t>Comando: git clone https://github.com/andresmunozl/proyectoEquipos.git</w:t>
+      </w:r>
+    </w:p>
+    <w:p>
+      <w:pPr>
+        <w:pStyle w:val="Listaconnmeros"/>
+      </w:pPr>
+      <w:r>
+        <w:t>Navegar al directorio del proyecto</w:t>
+      </w:r>
+    </w:p>
+    <w:p>
+      <w:pPr>
+        <w:pStyle w:val="Listaconvietas2"/>
+      </w:pPr>
       <w:r>
         <w:rPr>
           <w:i/>
           <w:color w:val="006400"/>
-          <w:lang w:val="es-CO"/>
-        </w:rPr>
-        <w:t>git</w:t>
-      </w:r>
-      <w:proofErr w:type="spellEnd"/>
+        </w:rPr>
+        <w:t>Comando: cd proyectoEquipos/principal</w:t>
+      </w:r>
+    </w:p>
+    <w:p>
+      <w:pPr>
+        <w:pStyle w:val="Listaconnmeros"/>
+      </w:pPr>
+      <w:r>
+        <w:t>Crear ambiente virtual</w:t>
+      </w:r>
+    </w:p>
+    <w:p>
+      <w:pPr>
+        <w:pStyle w:val="Listaconvietas2"/>
+        <w:rPr>
+          <w:lang w:val="es-CO"/>
+        </w:rPr>
+      </w:pPr>
       <w:r>
         <w:rPr>
           <w:i/>
           <w:color w:val="006400"/>
           <w:lang w:val="es-CO"/>
         </w:rPr>
-        <w:t xml:space="preserve"> clone https://github.com/andresmunozl/proyectoEquipos.git</w:t>
+        <w:t>Comando: python3 -m venv envs/virtualequipos</w:t>
       </w:r>
     </w:p>
     <w:p>
       <w:pPr>
         <w:pStyle w:val="Listaconnmeros"/>
       </w:pPr>
-      <w:proofErr w:type="spellStart"/>
-      <w:r>
-        <w:t>Navegar</w:t>
-      </w:r>
-      <w:proofErr w:type="spellEnd"/>
-      <w:r>
-        <w:t xml:space="preserve"> al </w:t>
-      </w:r>
-      <w:proofErr w:type="spellStart"/>
-      <w:r>
-        <w:t>directorio</w:t>
-      </w:r>
-      <w:proofErr w:type="spellEnd"/>
-      <w:r>
-        <w:t xml:space="preserve"> del proyecto</w:t>
+      <w:r>
+        <w:t>Activar ambiente virtual</w:t>
       </w:r>
     </w:p>
     <w:p>
       <w:pPr>
         <w:pStyle w:val="Listaconvietas2"/>
+        <w:rPr>
+          <w:lang w:val="es-CO"/>
+        </w:rPr>
       </w:pPr>
       <w:r>
         <w:rPr>
           <w:i/>
           <w:color w:val="006400"/>
-        </w:rPr>
-        <w:t>Comando: cd proyectoEquipos/principal</w:t>
+          <w:lang w:val="es-CO"/>
+        </w:rPr>
+        <w:t>Comando: source envs/virtualequipos/bin/activate (macOS/Linux) o .\envs\virtualequipos\Scripts\Activate.ps1 (Windows)</w:t>
       </w:r>
     </w:p>
     <w:p>
@@ -919,300 +784,57 @@
         <w:pStyle w:val="Listaconnmeros"/>
       </w:pPr>
       <w:r>
-        <w:t>Crear ambiente virtual</w:t>
+        <w:t>Instalar dependencias</w:t>
       </w:r>
     </w:p>
     <w:p>
       <w:pPr>
         <w:pStyle w:val="Listaconvietas2"/>
-        <w:rPr>
-          <w:lang w:val="es-CO"/>
-        </w:rPr>
       </w:pPr>
       <w:r>
         <w:rPr>
           <w:i/>
           <w:color w:val="006400"/>
-          <w:lang w:val="es-CO"/>
-        </w:rPr>
-        <w:t xml:space="preserve">Comando: python3 -m </w:t>
-      </w:r>
-      <w:proofErr w:type="spellStart"/>
+        </w:rPr>
+        <w:t>Comando: pip install -r requirements.txt</w:t>
+      </w:r>
+    </w:p>
+    <w:p>
+      <w:pPr>
+        <w:pStyle w:val="Listaconnmeros"/>
+      </w:pPr>
+      <w:r>
+        <w:t>Ejecutar migraciones</w:t>
+      </w:r>
+    </w:p>
+    <w:p>
+      <w:pPr>
+        <w:pStyle w:val="Listaconvietas2"/>
+      </w:pPr>
       <w:r>
         <w:rPr>
           <w:i/>
           <w:color w:val="006400"/>
-          <w:lang w:val="es-CO"/>
-        </w:rPr>
-        <w:t>venv</w:t>
-      </w:r>
-      <w:proofErr w:type="spellEnd"/>
+        </w:rPr>
+        <w:t>Comando: python manage.py migrate</w:t>
+      </w:r>
+    </w:p>
+    <w:p>
+      <w:pPr>
+        <w:pStyle w:val="Listaconnmeros"/>
+      </w:pPr>
+      <w:r>
+        <w:t>Verificar que el proyecto funciona</w:t>
+      </w:r>
+    </w:p>
+    <w:p>
+      <w:pPr>
+        <w:pStyle w:val="Listaconvietas2"/>
+      </w:pPr>
       <w:r>
         <w:rPr>
           <w:i/>
           <w:color w:val="006400"/>
-          <w:lang w:val="es-CO"/>
-        </w:rPr>
-        <w:t xml:space="preserve"> </w:t>
-      </w:r>
-      <w:proofErr w:type="spellStart"/>
-      <w:r>
-        <w:rPr>
-          <w:i/>
-          <w:color w:val="006400"/>
-          <w:lang w:val="es-CO"/>
-        </w:rPr>
-        <w:t>envs</w:t>
-      </w:r>
-      <w:proofErr w:type="spellEnd"/>
-      <w:r>
-        <w:rPr>
-          <w:i/>
-          <w:color w:val="006400"/>
-          <w:lang w:val="es-CO"/>
-        </w:rPr>
-        <w:t>/</w:t>
-      </w:r>
-      <w:proofErr w:type="spellStart"/>
-      <w:r>
-        <w:rPr>
-          <w:i/>
-          <w:color w:val="006400"/>
-          <w:lang w:val="es-CO"/>
-        </w:rPr>
-        <w:t>virtualequipos</w:t>
-      </w:r>
-      <w:proofErr w:type="spellEnd"/>
-    </w:p>
-    <w:p>
-      <w:pPr>
-        <w:pStyle w:val="Listaconnmeros"/>
-      </w:pPr>
-      <w:proofErr w:type="spellStart"/>
-      <w:r>
-        <w:t>Activar</w:t>
-      </w:r>
-      <w:proofErr w:type="spellEnd"/>
-      <w:r>
-        <w:t xml:space="preserve"> </w:t>
-      </w:r>
-      <w:proofErr w:type="spellStart"/>
-      <w:r>
-        <w:t>ambiente</w:t>
-      </w:r>
-      <w:proofErr w:type="spellEnd"/>
-      <w:r>
-        <w:t xml:space="preserve"> virtual</w:t>
-      </w:r>
-    </w:p>
-    <w:p>
-      <w:pPr>
-        <w:pStyle w:val="Listaconvietas2"/>
-        <w:rPr>
-          <w:lang w:val="es-CO"/>
-        </w:rPr>
-      </w:pPr>
-      <w:r>
-        <w:rPr>
-          <w:i/>
-          <w:color w:val="006400"/>
-          <w:lang w:val="es-CO"/>
-        </w:rPr>
-        <w:t xml:space="preserve">Comando: </w:t>
-      </w:r>
-      <w:proofErr w:type="spellStart"/>
-      <w:r>
-        <w:rPr>
-          <w:i/>
-          <w:color w:val="006400"/>
-          <w:lang w:val="es-CO"/>
-        </w:rPr>
-        <w:t>source</w:t>
-      </w:r>
-      <w:proofErr w:type="spellEnd"/>
-      <w:r>
-        <w:rPr>
-          <w:i/>
-          <w:color w:val="006400"/>
-          <w:lang w:val="es-CO"/>
-        </w:rPr>
-        <w:t xml:space="preserve"> </w:t>
-      </w:r>
-      <w:proofErr w:type="spellStart"/>
-      <w:r>
-        <w:rPr>
-          <w:i/>
-          <w:color w:val="006400"/>
-          <w:lang w:val="es-CO"/>
-        </w:rPr>
-        <w:t>envs</w:t>
-      </w:r>
-      <w:proofErr w:type="spellEnd"/>
-      <w:r>
-        <w:rPr>
-          <w:i/>
-          <w:color w:val="006400"/>
-          <w:lang w:val="es-CO"/>
-        </w:rPr>
-        <w:t>/</w:t>
-      </w:r>
-      <w:proofErr w:type="spellStart"/>
-      <w:r>
-        <w:rPr>
-          <w:i/>
-          <w:color w:val="006400"/>
-          <w:lang w:val="es-CO"/>
-        </w:rPr>
-        <w:t>virtualequipos</w:t>
-      </w:r>
-      <w:proofErr w:type="spellEnd"/>
-      <w:r>
-        <w:rPr>
-          <w:i/>
-          <w:color w:val="006400"/>
-          <w:lang w:val="es-CO"/>
-        </w:rPr>
-        <w:t>/</w:t>
-      </w:r>
-      <w:proofErr w:type="spellStart"/>
-      <w:r>
-        <w:rPr>
-          <w:i/>
-          <w:color w:val="006400"/>
-          <w:lang w:val="es-CO"/>
-        </w:rPr>
-        <w:t>bin</w:t>
-      </w:r>
-      <w:proofErr w:type="spellEnd"/>
-      <w:r>
-        <w:rPr>
-          <w:i/>
-          <w:color w:val="006400"/>
-          <w:lang w:val="es-CO"/>
-        </w:rPr>
-        <w:t>/</w:t>
-      </w:r>
-      <w:proofErr w:type="spellStart"/>
-      <w:r>
-        <w:rPr>
-          <w:i/>
-          <w:color w:val="006400"/>
-          <w:lang w:val="es-CO"/>
-        </w:rPr>
-        <w:t>activate</w:t>
-      </w:r>
-      <w:proofErr w:type="spellEnd"/>
-      <w:r>
-        <w:rPr>
-          <w:i/>
-          <w:color w:val="006400"/>
-          <w:lang w:val="es-CO"/>
-        </w:rPr>
-        <w:t xml:space="preserve"> (macOS/Linux) o .\</w:t>
-      </w:r>
-      <w:proofErr w:type="spellStart"/>
-      <w:r>
-        <w:rPr>
-          <w:i/>
-          <w:color w:val="006400"/>
-          <w:lang w:val="es-CO"/>
-        </w:rPr>
-        <w:t>envs</w:t>
-      </w:r>
-      <w:proofErr w:type="spellEnd"/>
-      <w:r>
-        <w:rPr>
-          <w:i/>
-          <w:color w:val="006400"/>
-          <w:lang w:val="es-CO"/>
-        </w:rPr>
-        <w:t>\</w:t>
-      </w:r>
-      <w:proofErr w:type="spellStart"/>
-      <w:r>
-        <w:rPr>
-          <w:i/>
-          <w:color w:val="006400"/>
-          <w:lang w:val="es-CO"/>
-        </w:rPr>
-        <w:t>virtualequipos</w:t>
-      </w:r>
-      <w:proofErr w:type="spellEnd"/>
-      <w:r>
-        <w:rPr>
-          <w:i/>
-          <w:color w:val="006400"/>
-          <w:lang w:val="es-CO"/>
-        </w:rPr>
-        <w:t>\Scripts\Activate.ps1 (Windows)</w:t>
-      </w:r>
-    </w:p>
-    <w:p>
-      <w:pPr>
-        <w:pStyle w:val="Listaconnmeros"/>
-      </w:pPr>
-      <w:proofErr w:type="spellStart"/>
-      <w:r>
-        <w:t>Instalar</w:t>
-      </w:r>
-      <w:proofErr w:type="spellEnd"/>
-      <w:r>
-        <w:t xml:space="preserve"> </w:t>
-      </w:r>
-      <w:proofErr w:type="spellStart"/>
-      <w:r>
-        <w:t>dependencias</w:t>
-      </w:r>
-      <w:proofErr w:type="spellEnd"/>
-    </w:p>
-    <w:p>
-      <w:pPr>
-        <w:pStyle w:val="Listaconvietas2"/>
-      </w:pPr>
-      <w:r>
-        <w:rPr>
-          <w:i/>
-          <w:color w:val="006400"/>
-        </w:rPr>
-        <w:t>Comando: pip install -r requirements.txt</w:t>
-      </w:r>
-    </w:p>
-    <w:p>
-      <w:pPr>
-        <w:pStyle w:val="Listaconnmeros"/>
-      </w:pPr>
-      <w:r>
-        <w:t>Ejecutar migraciones</w:t>
-      </w:r>
-    </w:p>
-    <w:p>
-      <w:pPr>
-        <w:pStyle w:val="Listaconvietas2"/>
-      </w:pPr>
-      <w:r>
-        <w:rPr>
-          <w:i/>
-          <w:color w:val="006400"/>
-        </w:rPr>
-        <w:t>Comando: python manage.py migrate</w:t>
-      </w:r>
-    </w:p>
-    <w:p>
-      <w:pPr>
-        <w:pStyle w:val="Listaconnmeros"/>
-      </w:pPr>
-      <w:r>
-        <w:t>Verificar que el proyecto funciona</w:t>
-      </w:r>
-    </w:p>
-    <w:p>
-      <w:pPr>
-        <w:pStyle w:val="Listaconvietas2"/>
-      </w:pPr>
-      <w:r>
-        <w:rPr>
-          <w:i/>
-          <w:color w:val="006400"/>
         </w:rPr>
         <w:t>Comando: python manage.py runserver</w:t>
       </w:r>
@@ -1379,21 +1001,7 @@
         <w:rPr>
           <w:lang w:val="es-CO"/>
         </w:rPr>
-        <w:t xml:space="preserve">Ejecutar todas las pruebas: </w:t>
-      </w:r>
-      <w:proofErr w:type="spellStart"/>
-      <w:r>
-        <w:rPr>
-          <w:lang w:val="es-CO"/>
-        </w:rPr>
-        <w:t>python</w:t>
-      </w:r>
-      <w:proofErr w:type="spellEnd"/>
-      <w:r>
-        <w:rPr>
-          <w:lang w:val="es-CO"/>
-        </w:rPr>
-        <w:t xml:space="preserve"> manage.py test</w:t>
+        <w:t>Ejecutar todas las pruebas: python manage.py test</w:t>
       </w:r>
     </w:p>
     <w:p>
@@ -1407,21 +1015,7 @@
         <w:rPr>
           <w:lang w:val="es-CO"/>
         </w:rPr>
-        <w:t>Capturar evidencia (</w:t>
-      </w:r>
-      <w:proofErr w:type="spellStart"/>
-      <w:r>
-        <w:rPr>
-          <w:lang w:val="es-CO"/>
-        </w:rPr>
-        <w:t>screenshot</w:t>
-      </w:r>
-      <w:proofErr w:type="spellEnd"/>
-      <w:r>
-        <w:rPr>
-          <w:lang w:val="es-CO"/>
-        </w:rPr>
-        <w:t>) del resultado completo</w:t>
+        <w:t>Capturar evidencia (screenshot) del resultado completo</w:t>
       </w:r>
     </w:p>
     <w:p>
@@ -1463,21 +1057,7 @@
         <w:rPr>
           <w:lang w:val="es-CO"/>
         </w:rPr>
-        <w:t xml:space="preserve">Registrar en un documento Excel/Google </w:t>
-      </w:r>
-      <w:proofErr w:type="spellStart"/>
-      <w:r>
-        <w:rPr>
-          <w:lang w:val="es-CO"/>
-        </w:rPr>
-        <w:t>Sheet</w:t>
-      </w:r>
-      <w:proofErr w:type="spellEnd"/>
-      <w:r>
-        <w:rPr>
-          <w:lang w:val="es-CO"/>
-        </w:rPr>
-        <w:t xml:space="preserve"> el resultado de cada prueba</w:t>
+        <w:t>Registrar en un documento Excel/Google Sheet el resultado de cada prueba</w:t>
       </w:r>
     </w:p>
     <w:p>
@@ -1526,21 +1106,8 @@
       <w:pPr>
         <w:pStyle w:val="Ttulo2"/>
       </w:pPr>
-      <w:proofErr w:type="spellStart"/>
-      <w:r>
-        <w:t>Pruebas</w:t>
-      </w:r>
-      <w:proofErr w:type="spellEnd"/>
-      <w:r>
-        <w:t xml:space="preserve"> a </w:t>
-      </w:r>
-      <w:proofErr w:type="spellStart"/>
-      <w:r>
-        <w:t>Ejecutar</w:t>
-      </w:r>
-      <w:proofErr w:type="spellEnd"/>
-      <w:r>
-        <w:t>:</w:t>
+      <w:r>
+        <w:t>Pruebas a Ejecutar:</w:t>
       </w:r>
     </w:p>
     <w:tbl>
@@ -1639,21 +1206,7 @@
               <w:rPr>
                 <w:lang w:val="es-CO"/>
               </w:rPr>
-              <w:t xml:space="preserve">Ejecuta los 46 </w:t>
-            </w:r>
-            <w:proofErr w:type="spellStart"/>
-            <w:r>
-              <w:rPr>
-                <w:lang w:val="es-CO"/>
-              </w:rPr>
-              <w:t>tests</w:t>
-            </w:r>
-            <w:proofErr w:type="spellEnd"/>
-            <w:r>
-              <w:rPr>
-                <w:lang w:val="es-CO"/>
-              </w:rPr>
-              <w:t xml:space="preserve"> del proyecto</w:t>
+              <w:t>Ejecuta los 46 tests del proyecto</w:t>
             </w:r>
           </w:p>
         </w:tc>
@@ -1668,19 +1221,9 @@
             <w:tcW w:w="2880" w:type="dxa"/>
           </w:tcPr>
           <w:p>
-            <w:proofErr w:type="spellStart"/>
             <w:r>
-              <w:t>Pruebas</w:t>
+              <w:t>Pruebas de usuarios</w:t>
             </w:r>
-            <w:proofErr w:type="spellEnd"/>
-            <w:r>
-              <w:t xml:space="preserve"> de </w:t>
-            </w:r>
-            <w:proofErr w:type="spellStart"/>
-            <w:r>
-              <w:t>usuarios</w:t>
-            </w:r>
-            <w:proofErr w:type="spellEnd"/>
           </w:p>
         </w:tc>
         <w:tc>
@@ -1711,21 +1254,7 @@
               <w:rPr>
                 <w:lang w:val="es-CO"/>
               </w:rPr>
-              <w:t xml:space="preserve">Ejecuta 15 </w:t>
-            </w:r>
-            <w:proofErr w:type="spellStart"/>
-            <w:r>
-              <w:rPr>
-                <w:lang w:val="es-CO"/>
-              </w:rPr>
-              <w:t>tests</w:t>
-            </w:r>
-            <w:proofErr w:type="spellEnd"/>
-            <w:r>
-              <w:rPr>
-                <w:lang w:val="es-CO"/>
-              </w:rPr>
-              <w:t xml:space="preserve"> del módulo usuarios</w:t>
+              <w:t>Ejecuta 15 tests del módulo usuarios</w:t>
             </w:r>
           </w:p>
         </w:tc>
@@ -1740,19 +1269,9 @@
             <w:tcW w:w="2880" w:type="dxa"/>
           </w:tcPr>
           <w:p>
-            <w:proofErr w:type="spellStart"/>
             <w:r>
-              <w:t>Pruebas</w:t>
+              <w:t>Pruebas de categorías</w:t>
             </w:r>
-            <w:proofErr w:type="spellEnd"/>
-            <w:r>
-              <w:t xml:space="preserve"> de </w:t>
-            </w:r>
-            <w:proofErr w:type="spellStart"/>
-            <w:r>
-              <w:t>categorías</w:t>
-            </w:r>
-            <w:proofErr w:type="spellEnd"/>
           </w:p>
         </w:tc>
         <w:tc>
@@ -1783,21 +1302,7 @@
               <w:rPr>
                 <w:lang w:val="es-CO"/>
               </w:rPr>
-              <w:t xml:space="preserve">Ejecuta 17 </w:t>
-            </w:r>
-            <w:proofErr w:type="spellStart"/>
-            <w:r>
-              <w:rPr>
-                <w:lang w:val="es-CO"/>
-              </w:rPr>
-              <w:t>tests</w:t>
-            </w:r>
-            <w:proofErr w:type="spellEnd"/>
-            <w:r>
-              <w:rPr>
-                <w:lang w:val="es-CO"/>
-              </w:rPr>
-              <w:t xml:space="preserve"> del módulo categorías</w:t>
+              <w:t>Ejecuta 17 tests del módulo categorías</w:t>
             </w:r>
           </w:p>
         </w:tc>
@@ -1812,19 +1317,9 @@
             <w:tcW w:w="2880" w:type="dxa"/>
           </w:tcPr>
           <w:p>
-            <w:proofErr w:type="spellStart"/>
             <w:r>
-              <w:t>Pruebas</w:t>
+              <w:t>Pruebas de mantenimiento</w:t>
             </w:r>
-            <w:proofErr w:type="spellEnd"/>
-            <w:r>
-              <w:t xml:space="preserve"> de </w:t>
-            </w:r>
-            <w:proofErr w:type="spellStart"/>
-            <w:r>
-              <w:t>mantenimiento</w:t>
-            </w:r>
-            <w:proofErr w:type="spellEnd"/>
           </w:p>
         </w:tc>
         <w:tc>
@@ -1855,21 +1350,7 @@
               <w:rPr>
                 <w:lang w:val="es-CO"/>
               </w:rPr>
-              <w:t xml:space="preserve">Ejecuta 14 </w:t>
-            </w:r>
-            <w:proofErr w:type="spellStart"/>
-            <w:r>
-              <w:rPr>
-                <w:lang w:val="es-CO"/>
-              </w:rPr>
-              <w:t>tests</w:t>
-            </w:r>
-            <w:proofErr w:type="spellEnd"/>
-            <w:r>
-              <w:rPr>
-                <w:lang w:val="es-CO"/>
-              </w:rPr>
-              <w:t xml:space="preserve"> del módulo mantenimiento</w:t>
+              <w:t>Ejecuta 14 tests del módulo mantenimiento</w:t>
             </w:r>
           </w:p>
         </w:tc>
@@ -1879,21 +1360,8 @@
       <w:pPr>
         <w:pStyle w:val="Ttulo2"/>
       </w:pPr>
-      <w:proofErr w:type="spellStart"/>
-      <w:r>
-        <w:t>Evidencia</w:t>
-      </w:r>
-      <w:proofErr w:type="spellEnd"/>
-      <w:r>
-        <w:t xml:space="preserve"> </w:t>
-      </w:r>
-      <w:proofErr w:type="spellStart"/>
-      <w:r>
-        <w:t>Requerida</w:t>
-      </w:r>
-      <w:proofErr w:type="spellEnd"/>
-      <w:r>
-        <w:t>:</w:t>
+      <w:r>
+        <w:t>Evidencia Requerida:</w:t>
       </w:r>
     </w:p>
     <w:p>
@@ -1907,43 +1375,130 @@
     <w:p>
       <w:pPr>
         <w:pStyle w:val="Listaconvietas2"/>
-        <w:rPr>
-          <w:lang w:val="es-CO"/>
-        </w:rPr>
-      </w:pPr>
-      <w:r>
-        <w:rPr>
-          <w:lang w:val="es-CO"/>
-        </w:rPr>
-        <w:t>Resultado de "</w:t>
-      </w:r>
-      <w:proofErr w:type="spellStart"/>
-      <w:r>
-        <w:rPr>
-          <w:lang w:val="es-CO"/>
-        </w:rPr>
-        <w:t>python</w:t>
-      </w:r>
-      <w:proofErr w:type="spellEnd"/>
-      <w:r>
-        <w:rPr>
-          <w:lang w:val="es-CO"/>
-        </w:rPr>
-        <w:t xml:space="preserve"> manage.py test" (todos los </w:t>
-      </w:r>
-      <w:proofErr w:type="spellStart"/>
-      <w:r>
-        <w:rPr>
-          <w:lang w:val="es-CO"/>
-        </w:rPr>
-        <w:t>tests</w:t>
-      </w:r>
-      <w:proofErr w:type="spellEnd"/>
-      <w:r>
-        <w:rPr>
-          <w:lang w:val="es-CO"/>
-        </w:rPr>
-        <w:t>)</w:t>
+        <w:spacing w:line="240" w:lineRule="auto"/>
+        <w:rPr>
+          <w:lang w:val="es-CO"/>
+        </w:rPr>
+      </w:pPr>
+      <w:r>
+        <w:rPr>
+          <w:lang w:val="es-CO"/>
+        </w:rPr>
+        <w:t>Resultado de "python manage.py test" (todos los tests)</w:t>
+      </w:r>
+      <w:r>
+        <w:rPr>
+          <w:lang w:val="es-CO"/>
+        </w:rPr>
+        <w:tab/>
+      </w:r>
+      <w:r>
+        <w:rPr>
+          <w:lang w:val="es-CO"/>
+        </w:rPr>
+        <w:tab/>
+      </w:r>
+      <w:r>
+        <w:rPr>
+          <w:lang w:val="es-CO"/>
+        </w:rPr>
+        <w:tab/>
+      </w:r>
+      <w:r>
+        <w:rPr>
+          <w:lang w:val="es-CO"/>
+        </w:rPr>
+        <w:tab/>
+      </w:r>
+      <w:r>
+        <w:rPr>
+          <w:lang w:val="es-CO"/>
+        </w:rPr>
+        <w:tab/>
+      </w:r>
+      <w:r>
+        <w:rPr>
+          <w:lang w:val="es-CO"/>
+        </w:rPr>
+        <w:tab/>
+      </w:r>
+      <w:r>
+        <w:rPr>
+          <w:lang w:val="es-CO"/>
+        </w:rPr>
+        <w:tab/>
+      </w:r>
+      <w:r>
+        <w:rPr>
+          <w:lang w:val="es-CO"/>
+        </w:rPr>
+        <w:tab/>
+      </w:r>
+      <w:r>
+        <w:rPr>
+          <w:lang w:val="es-CO"/>
+        </w:rPr>
+        <w:tab/>
+      </w:r>
+      <w:r>
+        <w:rPr>
+          <w:lang w:val="es-CO"/>
+        </w:rPr>
+        <w:tab/>
+      </w:r>
+      <w:r>
+        <w:rPr>
+          <w:lang w:val="es-CO"/>
+        </w:rPr>
+        <w:tab/>
+      </w:r>
+      <w:r>
+        <w:rPr>
+          <w:lang w:val="es-CO"/>
+        </w:rPr>
+        <w:tab/>
+      </w:r>
+      <w:r>
+        <w:rPr>
+          <w:lang w:val="es-CO"/>
+        </w:rPr>
+        <w:tab/>
+      </w:r>
+      <w:r>
+        <w:rPr>
+          <w:lang w:val="es-CO"/>
+        </w:rPr>
+        <w:tab/>
+      </w:r>
+      <w:r>
+        <w:rPr>
+          <w:lang w:val="es-CO"/>
+        </w:rPr>
+        <w:tab/>
+      </w:r>
+      <w:r>
+        <w:rPr>
+          <w:lang w:val="es-CO"/>
+        </w:rPr>
+        <w:tab/>
+      </w:r>
+      <w:r>
+        <w:rPr>
+          <w:lang w:val="es-CO"/>
+        </w:rPr>
+        <w:tab/>
+      </w:r>
+      <w:r>
+        <w:rPr>
+          <w:lang w:val="es-CO"/>
+        </w:rPr>
+        <w:tab/>
+      </w:r>
+      <w:r>
+        <w:rPr>
+          <w:lang w:val="es-CO"/>
+        </w:rPr>
+        <w:tab/>
       </w:r>
     </w:p>
     <w:p>
@@ -1976,9 +1531,7 @@
     </w:p>
     <w:p>
       <w:pPr>
-        <w:rPr>
-          <w:lang w:val="es-CO"/>
-        </w:rPr>
+        <w:cnfStyle w:val="000000100000" w:firstRow="0" w:lastRow="0" w:firstColumn="0" w:lastColumn="0" w:oddVBand="0" w:evenVBand="0" w:oddHBand="1" w:evenHBand="0" w:firstRowFirstColumn="0" w:firstRowLastColumn="0" w:lastRowFirstColumn="0" w:lastRowLastColumn="0"/>
       </w:pPr>
       <w:r>
         <w:rPr>
@@ -1986,6 +1539,17 @@
         </w:rPr>
         <w:br w:type="page"/>
       </w:r>
+      <w:r>
+        <w:lastRenderedPageBreak/>
+        <w:t>python manage.py test</w:t>
+      </w:r>
+    </w:p>
+    <w:p>
+      <w:pPr>
+        <w:rPr>
+          <w:lang w:val="es-CO"/>
+        </w:rPr>
+      </w:pPr>
     </w:p>
     <w:p>
       <w:pPr>
@@ -1998,7 +1562,6 @@
         <w:rPr>
           <w:lang w:val="es-CO"/>
         </w:rPr>
-        <w:lastRenderedPageBreak/>
         <w:t>6. Parte 3: Corrección de Errores en Pruebas</w:t>
       </w:r>
     </w:p>
@@ -2026,42 +1589,15 @@
         <w:rPr>
           <w:lang w:val="es-CO"/>
         </w:rPr>
-        <w:t xml:space="preserve">El proyecto contiene intencionalmente 4 pruebas que fallan. Los estudiantes deben identificar cuáles son, analizar los mensajes de error y corregir el código correspondiente (en los </w:t>
-      </w:r>
-      <w:proofErr w:type="spellStart"/>
-      <w:r>
-        <w:rPr>
-          <w:lang w:val="es-CO"/>
-        </w:rPr>
-        <w:t>tests</w:t>
-      </w:r>
-      <w:proofErr w:type="spellEnd"/>
-      <w:r>
-        <w:rPr>
-          <w:lang w:val="es-CO"/>
-        </w:rPr>
-        <w:t xml:space="preserve"> o en el código fuente).</w:t>
+        <w:t>El proyecto contiene intencionalmente 4 pruebas que fallan. Los estudiantes deben identificar cuáles son, analizar los mensajes de error y corregir el código correspondiente (en los tests o en el código fuente).</w:t>
       </w:r>
     </w:p>
     <w:p>
       <w:pPr>
         <w:pStyle w:val="Ttulo2"/>
       </w:pPr>
-      <w:proofErr w:type="spellStart"/>
-      <w:r>
-        <w:t>Actividades</w:t>
-      </w:r>
-      <w:proofErr w:type="spellEnd"/>
-      <w:r>
-        <w:t xml:space="preserve"> del </w:t>
-      </w:r>
-      <w:proofErr w:type="spellStart"/>
-      <w:r>
-        <w:t>Estudiante</w:t>
-      </w:r>
-      <w:proofErr w:type="spellEnd"/>
-      <w:r>
-        <w:t>:</w:t>
+      <w:r>
+        <w:t>Actividades del Estudiante:</w:t>
       </w:r>
     </w:p>
     <w:p>
@@ -2075,21 +1611,7 @@
         <w:rPr>
           <w:lang w:val="es-CO"/>
         </w:rPr>
-        <w:t xml:space="preserve">Ejecutar: </w:t>
-      </w:r>
-      <w:proofErr w:type="spellStart"/>
-      <w:r>
-        <w:rPr>
-          <w:lang w:val="es-CO"/>
-        </w:rPr>
-        <w:t>python</w:t>
-      </w:r>
-      <w:proofErr w:type="spellEnd"/>
-      <w:r>
-        <w:rPr>
-          <w:lang w:val="es-CO"/>
-        </w:rPr>
-        <w:t xml:space="preserve"> manage.py test para identificar cuáles pruebas fallan</w:t>
+        <w:t>Ejecutar: python manage.py test para identificar cuáles pruebas fallan</w:t>
       </w:r>
     </w:p>
     <w:p>
@@ -2189,21 +1711,7 @@
         <w:rPr>
           <w:lang w:val="es-CO"/>
         </w:rPr>
-        <w:t>Realizar correcciones (puede ser en el test o en el modelo/</w:t>
-      </w:r>
-      <w:proofErr w:type="spellStart"/>
-      <w:r>
-        <w:rPr>
-          <w:lang w:val="es-CO"/>
-        </w:rPr>
-        <w:t>serializer</w:t>
-      </w:r>
-      <w:proofErr w:type="spellEnd"/>
-      <w:r>
-        <w:rPr>
-          <w:lang w:val="es-CO"/>
-        </w:rPr>
-        <w:t>)</w:t>
+        <w:t>Realizar correcciones (puede ser en el test o en el modelo/serializer)</w:t>
       </w:r>
     </w:p>
     <w:p>
@@ -2268,11 +1776,9 @@
             <w:tcW w:w="4320" w:type="dxa"/>
           </w:tcPr>
           <w:p>
-            <w:proofErr w:type="spellStart"/>
             <w:r>
               <w:t>Módulo</w:t>
             </w:r>
-            <w:proofErr w:type="spellEnd"/>
           </w:p>
         </w:tc>
         <w:tc>
@@ -2396,42 +1902,15 @@
         <w:rPr>
           <w:lang w:val="es-CO"/>
         </w:rPr>
-        <w:t xml:space="preserve">Captura de pantalla mostrando todos los </w:t>
-      </w:r>
-      <w:proofErr w:type="spellStart"/>
-      <w:r>
-        <w:rPr>
-          <w:lang w:val="es-CO"/>
-        </w:rPr>
-        <w:t>tests</w:t>
-      </w:r>
-      <w:proofErr w:type="spellEnd"/>
-      <w:r>
-        <w:rPr>
-          <w:lang w:val="es-CO"/>
-        </w:rPr>
-        <w:t xml:space="preserve"> pasando</w:t>
+        <w:t>Captura de pantalla mostrando todos los tests pasando</w:t>
       </w:r>
     </w:p>
     <w:p>
       <w:pPr>
         <w:pStyle w:val="Listaconvietas"/>
       </w:pPr>
-      <w:proofErr w:type="spellStart"/>
-      <w:r>
-        <w:t>Archivo</w:t>
-      </w:r>
-      <w:proofErr w:type="spellEnd"/>
-      <w:r>
-        <w:t xml:space="preserve"> CORRECCIONES.md </w:t>
-      </w:r>
-      <w:proofErr w:type="spellStart"/>
-      <w:r>
-        <w:t>detallando</w:t>
-      </w:r>
-      <w:proofErr w:type="spellEnd"/>
-      <w:r>
-        <w:t>:</w:t>
+      <w:r>
+        <w:t>Archivo CORRECCIONES.md detallando:</w:t>
       </w:r>
     </w:p>
     <w:p>
@@ -2490,84 +1969,15 @@
         <w:rPr>
           <w:lang w:val="es-CO"/>
         </w:rPr>
-        <w:t xml:space="preserve">Los estudiantes deben crear un </w:t>
-      </w:r>
-      <w:proofErr w:type="spellStart"/>
-      <w:r>
-        <w:rPr>
-          <w:lang w:val="es-CO"/>
-        </w:rPr>
-        <w:t>workflow</w:t>
-      </w:r>
-      <w:proofErr w:type="spellEnd"/>
-      <w:r>
-        <w:rPr>
-          <w:lang w:val="es-CO"/>
-        </w:rPr>
-        <w:t xml:space="preserve"> de GitHub </w:t>
-      </w:r>
-      <w:proofErr w:type="spellStart"/>
-      <w:r>
-        <w:rPr>
-          <w:lang w:val="es-CO"/>
-        </w:rPr>
-        <w:t>Actions</w:t>
-      </w:r>
-      <w:proofErr w:type="spellEnd"/>
-      <w:r>
-        <w:rPr>
-          <w:lang w:val="es-CO"/>
-        </w:rPr>
-        <w:t xml:space="preserve"> que ejecute automáticamente las pruebas cada vez que se haga </w:t>
-      </w:r>
-      <w:proofErr w:type="spellStart"/>
-      <w:r>
-        <w:rPr>
-          <w:lang w:val="es-CO"/>
-        </w:rPr>
-        <w:t>push</w:t>
-      </w:r>
-      <w:proofErr w:type="spellEnd"/>
-      <w:r>
-        <w:rPr>
-          <w:lang w:val="es-CO"/>
-        </w:rPr>
-        <w:t xml:space="preserve"> al repositorio. Deben investigar, diseñar e implementar la solución por su cuenta, sin usar como referencia un </w:t>
-      </w:r>
-      <w:proofErr w:type="spellStart"/>
-      <w:r>
-        <w:rPr>
-          <w:lang w:val="es-CO"/>
-        </w:rPr>
-        <w:t>workflow</w:t>
-      </w:r>
-      <w:proofErr w:type="spellEnd"/>
-      <w:r>
-        <w:rPr>
-          <w:lang w:val="es-CO"/>
-        </w:rPr>
-        <w:t xml:space="preserve"> existente.</w:t>
+        <w:t>Los estudiantes deben crear un workflow de GitHub Actions que ejecute automáticamente las pruebas cada vez que se haga push al repositorio. Deben investigar, diseñar e implementar la solución por su cuenta, sin usar como referencia un workflow existente.</w:t>
       </w:r>
     </w:p>
     <w:p>
       <w:pPr>
         <w:pStyle w:val="Ttulo2"/>
       </w:pPr>
-      <w:proofErr w:type="spellStart"/>
-      <w:r>
-        <w:t>Conceptos</w:t>
-      </w:r>
-      <w:proofErr w:type="spellEnd"/>
-      <w:r>
-        <w:t xml:space="preserve"> Clave a </w:t>
-      </w:r>
-      <w:proofErr w:type="spellStart"/>
-      <w:r>
-        <w:t>Aprender</w:t>
-      </w:r>
-      <w:proofErr w:type="spellEnd"/>
-      <w:r>
-        <w:t>:</w:t>
+      <w:r>
+        <w:t>Conceptos Clave a Aprender:</w:t>
       </w:r>
     </w:p>
     <w:p>
@@ -2595,21 +2005,7 @@
         <w:rPr>
           <w:lang w:val="es-CO"/>
         </w:rPr>
-        <w:t xml:space="preserve">GitHub </w:t>
-      </w:r>
-      <w:proofErr w:type="spellStart"/>
-      <w:r>
-        <w:rPr>
-          <w:lang w:val="es-CO"/>
-        </w:rPr>
-        <w:t>Actions</w:t>
-      </w:r>
-      <w:proofErr w:type="spellEnd"/>
-      <w:r>
-        <w:rPr>
-          <w:lang w:val="es-CO"/>
-        </w:rPr>
-        <w:t>: Plataforma de automatización de GitHub</w:t>
+        <w:t>GitHub Actions: Plataforma de automatización de GitHub</w:t>
       </w:r>
     </w:p>
     <w:p>
@@ -2619,19 +2015,11 @@
           <w:lang w:val="es-CO"/>
         </w:rPr>
       </w:pPr>
-      <w:proofErr w:type="spellStart"/>
-      <w:r>
-        <w:rPr>
-          <w:lang w:val="es-CO"/>
-        </w:rPr>
-        <w:t>Workflows</w:t>
-      </w:r>
-      <w:proofErr w:type="spellEnd"/>
-      <w:r>
-        <w:rPr>
-          <w:lang w:val="es-CO"/>
-        </w:rPr>
-        <w:t>: Configuraciones YAML que definen acciones automatizadas</w:t>
+      <w:r>
+        <w:rPr>
+          <w:lang w:val="es-CO"/>
+        </w:rPr>
+        <w:t>Workflows: Configuraciones YAML que definen acciones automatizadas</w:t>
       </w:r>
     </w:p>
     <w:p>
@@ -2645,16 +2033,8 @@
         <w:rPr>
           <w:lang w:val="es-CO"/>
         </w:rPr>
-        <w:t xml:space="preserve">Runners: Servidores que ejecutan los </w:t>
-      </w:r>
-      <w:proofErr w:type="spellStart"/>
-      <w:r>
-        <w:rPr>
-          <w:lang w:val="es-CO"/>
-        </w:rPr>
-        <w:t>workflows</w:t>
-      </w:r>
-      <w:proofErr w:type="spellEnd"/>
+        <w:t>Runners: Servidores que ejecutan los workflows</w:t>
+      </w:r>
     </w:p>
     <w:p>
       <w:pPr>
@@ -2663,28 +2043,12 @@
           <w:lang w:val="es-CO"/>
         </w:rPr>
       </w:pPr>
-      <w:proofErr w:type="spellStart"/>
-      <w:r>
-        <w:rPr>
-          <w:lang w:val="es-CO"/>
-        </w:rPr>
-        <w:t>Actions</w:t>
-      </w:r>
-      <w:proofErr w:type="spellEnd"/>
-      <w:r>
-        <w:rPr>
-          <w:lang w:val="es-CO"/>
-        </w:rPr>
-        <w:t xml:space="preserve">: Tareas reutilizables en un </w:t>
-      </w:r>
-      <w:proofErr w:type="spellStart"/>
-      <w:r>
-        <w:rPr>
-          <w:lang w:val="es-CO"/>
-        </w:rPr>
-        <w:t>workflow</w:t>
-      </w:r>
-      <w:proofErr w:type="spellEnd"/>
+      <w:r>
+        <w:rPr>
+          <w:lang w:val="es-CO"/>
+        </w:rPr>
+        <w:t>Actions: Tareas reutilizables en un workflow</w:t>
+      </w:r>
     </w:p>
     <w:p>
       <w:pPr>
@@ -2697,21 +2061,7 @@
         <w:rPr>
           <w:lang w:val="es-CO"/>
         </w:rPr>
-        <w:t xml:space="preserve">Requisitos del </w:t>
-      </w:r>
-      <w:proofErr w:type="spellStart"/>
-      <w:r>
-        <w:rPr>
-          <w:lang w:val="es-CO"/>
-        </w:rPr>
-        <w:t>Workflow</w:t>
-      </w:r>
-      <w:proofErr w:type="spellEnd"/>
-      <w:r>
-        <w:rPr>
-          <w:lang w:val="es-CO"/>
-        </w:rPr>
-        <w:t xml:space="preserve"> a Implementar:</w:t>
+        <w:t>Requisitos del Workflow a Implementar:</w:t>
       </w:r>
     </w:p>
     <w:p>
@@ -2725,30 +2075,8 @@
         <w:rPr>
           <w:lang w:val="es-CO"/>
         </w:rPr>
-        <w:t xml:space="preserve">Debe ejecutarse automáticamente en cada </w:t>
-      </w:r>
-      <w:proofErr w:type="spellStart"/>
-      <w:r>
-        <w:rPr>
-          <w:lang w:val="es-CO"/>
-        </w:rPr>
-        <w:t>push</w:t>
-      </w:r>
-      <w:proofErr w:type="spellEnd"/>
-      <w:r>
-        <w:rPr>
-          <w:lang w:val="es-CO"/>
-        </w:rPr>
-        <w:t xml:space="preserve"> a la rama </w:t>
-      </w:r>
-      <w:proofErr w:type="spellStart"/>
-      <w:r>
-        <w:rPr>
-          <w:lang w:val="es-CO"/>
-        </w:rPr>
-        <w:t>main</w:t>
-      </w:r>
-      <w:proofErr w:type="spellEnd"/>
+        <w:t>Debe ejecutarse automáticamente en cada push a la rama main</w:t>
+      </w:r>
     </w:p>
     <w:p>
       <w:pPr>
@@ -2761,44 +2089,8 @@
         <w:rPr>
           <w:lang w:val="es-CO"/>
         </w:rPr>
-        <w:t xml:space="preserve">Debe ejecutarse en cada </w:t>
-      </w:r>
-      <w:proofErr w:type="spellStart"/>
-      <w:r>
-        <w:rPr>
-          <w:lang w:val="es-CO"/>
-        </w:rPr>
-        <w:t>pull</w:t>
-      </w:r>
-      <w:proofErr w:type="spellEnd"/>
-      <w:r>
-        <w:rPr>
-          <w:lang w:val="es-CO"/>
-        </w:rPr>
-        <w:t xml:space="preserve"> </w:t>
-      </w:r>
-      <w:proofErr w:type="spellStart"/>
-      <w:r>
-        <w:rPr>
-          <w:lang w:val="es-CO"/>
-        </w:rPr>
-        <w:t>request</w:t>
-      </w:r>
-      <w:proofErr w:type="spellEnd"/>
-      <w:r>
-        <w:rPr>
-          <w:lang w:val="es-CO"/>
-        </w:rPr>
-        <w:t xml:space="preserve"> a la rama </w:t>
-      </w:r>
-      <w:proofErr w:type="spellStart"/>
-      <w:r>
-        <w:rPr>
-          <w:lang w:val="es-CO"/>
-        </w:rPr>
-        <w:t>main</w:t>
-      </w:r>
-      <w:proofErr w:type="spellEnd"/>
+        <w:t>Debe ejecutarse en cada pull request a la rama main</w:t>
+      </w:r>
     </w:p>
     <w:p>
       <w:pPr>
@@ -2811,21 +2103,7 @@
         <w:rPr>
           <w:lang w:val="es-CO"/>
         </w:rPr>
-        <w:t>Debe usar un runner Ubuntu (</w:t>
-      </w:r>
-      <w:proofErr w:type="spellStart"/>
-      <w:r>
-        <w:rPr>
-          <w:lang w:val="es-CO"/>
-        </w:rPr>
-        <w:t>ubuntu-latest</w:t>
-      </w:r>
-      <w:proofErr w:type="spellEnd"/>
-      <w:r>
-        <w:rPr>
-          <w:lang w:val="es-CO"/>
-        </w:rPr>
-        <w:t>)</w:t>
+        <w:t>Debe usar un runner Ubuntu (ubuntu-latest)</w:t>
       </w:r>
     </w:p>
     <w:p>
@@ -2833,15 +2111,7 @@
         <w:pStyle w:val="Listaconvietas"/>
       </w:pPr>
       <w:r>
-        <w:t xml:space="preserve">Debe </w:t>
-      </w:r>
-      <w:proofErr w:type="spellStart"/>
-      <w:r>
-        <w:t>configurar</w:t>
-      </w:r>
-      <w:proofErr w:type="spellEnd"/>
-      <w:r>
-        <w:t xml:space="preserve"> Python 3.14</w:t>
+        <w:t>Debe configurar Python 3.14</w:t>
       </w:r>
     </w:p>
     <w:p>
@@ -2883,21 +2153,7 @@
         <w:rPr>
           <w:lang w:val="es-CO"/>
         </w:rPr>
-        <w:t xml:space="preserve">Debe ejecutar las pruebas unitarias: </w:t>
-      </w:r>
-      <w:proofErr w:type="spellStart"/>
-      <w:r>
-        <w:rPr>
-          <w:lang w:val="es-CO"/>
-        </w:rPr>
-        <w:t>python</w:t>
-      </w:r>
-      <w:proofErr w:type="spellEnd"/>
-      <w:r>
-        <w:rPr>
-          <w:lang w:val="es-CO"/>
-        </w:rPr>
-        <w:t xml:space="preserve"> manage.py test</w:t>
+        <w:t>Debe ejecutar las pruebas unitarias: python manage.py test</w:t>
       </w:r>
     </w:p>
     <w:p>
@@ -2918,13 +2174,8 @@
       <w:pPr>
         <w:pStyle w:val="Ttulo2"/>
       </w:pPr>
-      <w:proofErr w:type="spellStart"/>
-      <w:r>
-        <w:t>Archivo</w:t>
-      </w:r>
-      <w:proofErr w:type="spellEnd"/>
-      <w:r>
-        <w:t xml:space="preserve"> a Crear:</w:t>
+      <w:r>
+        <w:t>Archivo a Crear:</w:t>
       </w:r>
     </w:p>
     <w:p>
@@ -2947,21 +2198,7 @@
         <w:rPr>
           <w:lang w:val="es-CO"/>
         </w:rPr>
-        <w:t>Ubicación: En la raíz del repositorio (donde está .</w:t>
-      </w:r>
-      <w:proofErr w:type="spellStart"/>
-      <w:r>
-        <w:rPr>
-          <w:lang w:val="es-CO"/>
-        </w:rPr>
-        <w:t>git</w:t>
-      </w:r>
-      <w:proofErr w:type="spellEnd"/>
-      <w:r>
-        <w:rPr>
-          <w:lang w:val="es-CO"/>
-        </w:rPr>
-        <w:t>)</w:t>
+        <w:t>Ubicación: En la raíz del repositorio (donde está .git)</w:t>
       </w:r>
     </w:p>
     <w:p>
@@ -2975,21 +2212,7 @@
         <w:rPr>
           <w:lang w:val="es-CO"/>
         </w:rPr>
-        <w:t xml:space="preserve">Formato: YAML (lenguaje de configuración de GitHub </w:t>
-      </w:r>
-      <w:proofErr w:type="spellStart"/>
-      <w:r>
-        <w:rPr>
-          <w:lang w:val="es-CO"/>
-        </w:rPr>
-        <w:t>Actions</w:t>
-      </w:r>
-      <w:proofErr w:type="spellEnd"/>
-      <w:r>
-        <w:rPr>
-          <w:lang w:val="es-CO"/>
-        </w:rPr>
-        <w:t>)</w:t>
+        <w:t>Formato: YAML (lenguaje de configuración de GitHub Actions)</w:t>
       </w:r>
     </w:p>
     <w:p>
@@ -3003,21 +2226,7 @@
         <w:rPr>
           <w:lang w:val="es-CO"/>
         </w:rPr>
-        <w:t xml:space="preserve">Estructura Básica del </w:t>
-      </w:r>
-      <w:proofErr w:type="spellStart"/>
-      <w:r>
-        <w:rPr>
-          <w:lang w:val="es-CO"/>
-        </w:rPr>
-        <w:t>Workflow</w:t>
-      </w:r>
-      <w:proofErr w:type="spellEnd"/>
-      <w:r>
-        <w:rPr>
-          <w:lang w:val="es-CO"/>
-        </w:rPr>
-        <w:t xml:space="preserve"> (Referencia):</w:t>
+        <w:t>Estructura Básica del Workflow (Referencia):</w:t>
       </w:r>
     </w:p>
     <w:p>
@@ -3036,25 +2245,25 @@
           <w:sz w:val="18"/>
         </w:rPr>
         <w:br/>
-        <w:t>on: [push, pull_</w:t>
-      </w:r>
-      <w:proofErr w:type="gramStart"/>
+        <w:t>on: [push, pull_request]  # Triggers</w:t>
+      </w:r>
       <w:r>
         <w:rPr>
           <w:rFonts w:ascii="Courier New" w:hAnsi="Courier New"/>
           <w:color w:val="006400"/>
           <w:sz w:val="18"/>
         </w:rPr>
-        <w:t>request]  #</w:t>
-      </w:r>
-      <w:proofErr w:type="gramEnd"/>
+        <w:br/>
+        <w:t>jobs:</w:t>
+      </w:r>
       <w:r>
         <w:rPr>
           <w:rFonts w:ascii="Courier New" w:hAnsi="Courier New"/>
           <w:color w:val="006400"/>
           <w:sz w:val="18"/>
         </w:rPr>
-        <w:t xml:space="preserve"> Triggers</w:t>
+        <w:br/>
+        <w:t xml:space="preserve">  test:</w:t>
       </w:r>
       <w:r>
         <w:rPr>
@@ -3063,7 +2272,7 @@
           <w:sz w:val="18"/>
         </w:rPr>
         <w:br/>
-        <w:t>jobs:</w:t>
+        <w:t xml:space="preserve">    runs-on: ubuntu-latest</w:t>
       </w:r>
       <w:r>
         <w:rPr>
@@ -3072,7 +2281,7 @@
           <w:sz w:val="18"/>
         </w:rPr>
         <w:br/>
-        <w:t xml:space="preserve">  test:</w:t>
+        <w:t xml:space="preserve">    steps:</w:t>
       </w:r>
       <w:r>
         <w:rPr>
@@ -3081,7 +2290,7 @@
           <w:sz w:val="18"/>
         </w:rPr>
         <w:br/>
-        <w:t xml:space="preserve">    runs-on: ubuntu-latest</w:t>
+        <w:t xml:space="preserve">      - uses: actions/checkout@v4</w:t>
       </w:r>
       <w:r>
         <w:rPr>
@@ -3090,7 +2299,7 @@
           <w:sz w:val="18"/>
         </w:rPr>
         <w:br/>
-        <w:t xml:space="preserve">    steps:</w:t>
+        <w:t xml:space="preserve">      - uses: actions/setup-python@v5</w:t>
       </w:r>
       <w:r>
         <w:rPr>
@@ -3099,25 +2308,25 @@
           <w:sz w:val="18"/>
         </w:rPr>
         <w:br/>
-        <w:t xml:space="preserve">      - </w:t>
-      </w:r>
-      <w:proofErr w:type="gramStart"/>
+        <w:t xml:space="preserve">        with:</w:t>
+      </w:r>
       <w:r>
         <w:rPr>
           <w:rFonts w:ascii="Courier New" w:hAnsi="Courier New"/>
           <w:color w:val="006400"/>
           <w:sz w:val="18"/>
         </w:rPr>
-        <w:t>uses:</w:t>
-      </w:r>
-      <w:proofErr w:type="gramEnd"/>
+        <w:br/>
+        <w:t xml:space="preserve">          python-version: "3.14"</w:t>
+      </w:r>
       <w:r>
         <w:rPr>
           <w:rFonts w:ascii="Courier New" w:hAnsi="Courier New"/>
           <w:color w:val="006400"/>
           <w:sz w:val="18"/>
         </w:rPr>
-        <w:t xml:space="preserve"> actions/checkout@v4</w:t>
+        <w:br/>
+        <w:t xml:space="preserve">      - run: pip install -r principal/requirements.txt</w:t>
       </w:r>
       <w:r>
         <w:rPr>
@@ -3126,60 +2335,6 @@
           <w:sz w:val="18"/>
         </w:rPr>
         <w:br/>
-        <w:t xml:space="preserve">      - </w:t>
-      </w:r>
-      <w:proofErr w:type="gramStart"/>
-      <w:r>
-        <w:rPr>
-          <w:rFonts w:ascii="Courier New" w:hAnsi="Courier New"/>
-          <w:color w:val="006400"/>
-          <w:sz w:val="18"/>
-        </w:rPr>
-        <w:t>uses:</w:t>
-      </w:r>
-      <w:proofErr w:type="gramEnd"/>
-      <w:r>
-        <w:rPr>
-          <w:rFonts w:ascii="Courier New" w:hAnsi="Courier New"/>
-          <w:color w:val="006400"/>
-          <w:sz w:val="18"/>
-        </w:rPr>
-        <w:t xml:space="preserve"> actions/setup-python@v5</w:t>
-      </w:r>
-      <w:r>
-        <w:rPr>
-          <w:rFonts w:ascii="Courier New" w:hAnsi="Courier New"/>
-          <w:color w:val="006400"/>
-          <w:sz w:val="18"/>
-        </w:rPr>
-        <w:br/>
-        <w:t xml:space="preserve">        with:</w:t>
-      </w:r>
-      <w:r>
-        <w:rPr>
-          <w:rFonts w:ascii="Courier New" w:hAnsi="Courier New"/>
-          <w:color w:val="006400"/>
-          <w:sz w:val="18"/>
-        </w:rPr>
-        <w:br/>
-        <w:t xml:space="preserve">          python-version: "3.14"</w:t>
-      </w:r>
-      <w:r>
-        <w:rPr>
-          <w:rFonts w:ascii="Courier New" w:hAnsi="Courier New"/>
-          <w:color w:val="006400"/>
-          <w:sz w:val="18"/>
-        </w:rPr>
-        <w:br/>
-        <w:t xml:space="preserve">      - run: pip install -r principal/requirements.txt</w:t>
-      </w:r>
-      <w:r>
-        <w:rPr>
-          <w:rFonts w:ascii="Courier New" w:hAnsi="Courier New"/>
-          <w:color w:val="006400"/>
-          <w:sz w:val="18"/>
-        </w:rPr>
-        <w:br/>
         <w:t xml:space="preserve">      - run: cd principal &amp;&amp; python manage.py test</w:t>
       </w:r>
     </w:p>
@@ -3216,15 +2371,7 @@
         <w:pStyle w:val="Ttulo2"/>
       </w:pPr>
       <w:r>
-        <w:t xml:space="preserve">Pasos a </w:t>
-      </w:r>
-      <w:proofErr w:type="spellStart"/>
-      <w:r>
-        <w:t>Seguir</w:t>
-      </w:r>
-      <w:proofErr w:type="spellEnd"/>
-      <w:r>
-        <w:t>:</w:t>
+        <w:t>Pasos a Seguir:</w:t>
       </w:r>
     </w:p>
     <w:p>
@@ -3238,16 +2385,8 @@
         <w:rPr>
           <w:lang w:val="es-CO"/>
         </w:rPr>
-        <w:t xml:space="preserve">Investigar la documentación de GitHub </w:t>
-      </w:r>
-      <w:proofErr w:type="spellStart"/>
-      <w:r>
-        <w:rPr>
-          <w:lang w:val="es-CO"/>
-        </w:rPr>
-        <w:t>Actions</w:t>
-      </w:r>
-      <w:proofErr w:type="spellEnd"/>
+        <w:t>Investigar la documentación de GitHub Actions</w:t>
+      </w:r>
     </w:p>
     <w:p>
       <w:pPr>
@@ -3260,35 +2399,7 @@
         <w:rPr>
           <w:lang w:val="es-CO"/>
         </w:rPr>
-        <w:t>Crear la carpeta .</w:t>
-      </w:r>
-      <w:proofErr w:type="spellStart"/>
-      <w:r>
-        <w:rPr>
-          <w:lang w:val="es-CO"/>
-        </w:rPr>
-        <w:t>github</w:t>
-      </w:r>
-      <w:proofErr w:type="spellEnd"/>
-      <w:r>
-        <w:rPr>
-          <w:lang w:val="es-CO"/>
-        </w:rPr>
-        <w:t>/</w:t>
-      </w:r>
-      <w:proofErr w:type="spellStart"/>
-      <w:r>
-        <w:rPr>
-          <w:lang w:val="es-CO"/>
-        </w:rPr>
-        <w:t>workflows</w:t>
-      </w:r>
-      <w:proofErr w:type="spellEnd"/>
-      <w:r>
-        <w:rPr>
-          <w:lang w:val="es-CO"/>
-        </w:rPr>
-        <w:t xml:space="preserve"> en el repositorio local</w:t>
+        <w:t>Crear la carpeta .github/workflows en el repositorio local</w:t>
       </w:r>
     </w:p>
     <w:p>
@@ -3302,50 +2413,15 @@
         <w:rPr>
           <w:lang w:val="es-CO"/>
         </w:rPr>
-        <w:t xml:space="preserve">Crear el archivo </w:t>
-      </w:r>
-      <w:proofErr w:type="spellStart"/>
-      <w:r>
-        <w:rPr>
-          <w:lang w:val="es-CO"/>
-        </w:rPr>
-        <w:t>ci-pipeline.yml</w:t>
-      </w:r>
-      <w:proofErr w:type="spellEnd"/>
-      <w:r>
-        <w:rPr>
-          <w:lang w:val="es-CO"/>
-        </w:rPr>
-        <w:t xml:space="preserve"> con la configuración del </w:t>
-      </w:r>
-      <w:proofErr w:type="spellStart"/>
-      <w:r>
-        <w:rPr>
-          <w:lang w:val="es-CO"/>
-        </w:rPr>
-        <w:t>workflow</w:t>
-      </w:r>
-      <w:proofErr w:type="spellEnd"/>
+        <w:t>Crear el archivo ci-pipeline.yml con la configuración del workflow</w:t>
+      </w:r>
     </w:p>
     <w:p>
       <w:pPr>
         <w:pStyle w:val="Listaconnmeros"/>
       </w:pPr>
-      <w:proofErr w:type="spellStart"/>
-      <w:r>
-        <w:t>Definir</w:t>
-      </w:r>
-      <w:proofErr w:type="spellEnd"/>
-      <w:r>
-        <w:t xml:space="preserve"> </w:t>
-      </w:r>
-      <w:proofErr w:type="spellStart"/>
-      <w:r>
-        <w:t>los</w:t>
-      </w:r>
-      <w:proofErr w:type="spellEnd"/>
-      <w:r>
-        <w:t xml:space="preserve"> triggers (push y pull_request)</w:t>
+      <w:r>
+        <w:t>Definir los triggers (push y pull_request)</w:t>
       </w:r>
     </w:p>
     <w:p>
@@ -3373,21 +2449,7 @@
         <w:rPr>
           <w:lang w:val="es-CO"/>
         </w:rPr>
-        <w:t xml:space="preserve">Agregar </w:t>
-      </w:r>
-      <w:proofErr w:type="spellStart"/>
-      <w:r>
-        <w:rPr>
-          <w:lang w:val="es-CO"/>
-        </w:rPr>
-        <w:t>steps</w:t>
-      </w:r>
-      <w:proofErr w:type="spellEnd"/>
-      <w:r>
-        <w:rPr>
-          <w:lang w:val="es-CO"/>
-        </w:rPr>
-        <w:t xml:space="preserve"> para instalar dependencias y ejecutar pruebas</w:t>
+        <w:t>Agregar steps para instalar dependencias y ejecutar pruebas</w:t>
       </w:r>
     </w:p>
     <w:p>
@@ -3401,35 +2463,7 @@
         <w:rPr>
           <w:lang w:val="es-CO"/>
         </w:rPr>
-        <w:t xml:space="preserve">Hacer </w:t>
-      </w:r>
-      <w:proofErr w:type="spellStart"/>
-      <w:r>
-        <w:rPr>
-          <w:lang w:val="es-CO"/>
-        </w:rPr>
-        <w:t>push</w:t>
-      </w:r>
-      <w:proofErr w:type="spellEnd"/>
-      <w:r>
-        <w:rPr>
-          <w:lang w:val="es-CO"/>
-        </w:rPr>
-        <w:t xml:space="preserve"> del archivo .</w:t>
-      </w:r>
-      <w:proofErr w:type="spellStart"/>
-      <w:r>
-        <w:rPr>
-          <w:lang w:val="es-CO"/>
-        </w:rPr>
-        <w:t>yml</w:t>
-      </w:r>
-      <w:proofErr w:type="spellEnd"/>
-      <w:r>
-        <w:rPr>
-          <w:lang w:val="es-CO"/>
-        </w:rPr>
-        <w:t xml:space="preserve"> al repositorio</w:t>
+        <w:t>Hacer push del archivo .yml al repositorio</w:t>
       </w:r>
     </w:p>
     <w:p>
@@ -3443,78 +2477,15 @@
         <w:rPr>
           <w:lang w:val="es-CO"/>
         </w:rPr>
-        <w:t xml:space="preserve">Verificar en GitHub </w:t>
-      </w:r>
-      <w:proofErr w:type="spellStart"/>
-      <w:r>
-        <w:rPr>
-          <w:lang w:val="es-CO"/>
-        </w:rPr>
-        <w:t>Actions</w:t>
-      </w:r>
-      <w:proofErr w:type="spellEnd"/>
-      <w:r>
-        <w:rPr>
-          <w:lang w:val="es-CO"/>
-        </w:rPr>
-        <w:t xml:space="preserve"> </w:t>
-      </w:r>
-      <w:proofErr w:type="spellStart"/>
-      <w:r>
-        <w:rPr>
-          <w:lang w:val="es-CO"/>
-        </w:rPr>
-        <w:t>tab</w:t>
-      </w:r>
-      <w:proofErr w:type="spellEnd"/>
-      <w:r>
-        <w:rPr>
-          <w:lang w:val="es-CO"/>
-        </w:rPr>
-        <w:t xml:space="preserve"> que el </w:t>
-      </w:r>
-      <w:proofErr w:type="spellStart"/>
-      <w:r>
-        <w:rPr>
-          <w:lang w:val="es-CO"/>
-        </w:rPr>
-        <w:t>workflow</w:t>
-      </w:r>
-      <w:proofErr w:type="spellEnd"/>
-      <w:r>
-        <w:rPr>
-          <w:lang w:val="es-CO"/>
-        </w:rPr>
-        <w:t xml:space="preserve"> se ejecuta</w:t>
+        <w:t>Verificar en GitHub Actions tab que el workflow se ejecuta</w:t>
       </w:r>
     </w:p>
     <w:p>
       <w:pPr>
         <w:pStyle w:val="Listaconnmeros"/>
       </w:pPr>
-      <w:proofErr w:type="spellStart"/>
-      <w:r>
-        <w:t>Ajustar</w:t>
-      </w:r>
-      <w:proofErr w:type="spellEnd"/>
-      <w:r>
-        <w:t xml:space="preserve"> </w:t>
-      </w:r>
-      <w:proofErr w:type="spellStart"/>
-      <w:r>
-        <w:t>configuración</w:t>
-      </w:r>
-      <w:proofErr w:type="spellEnd"/>
-      <w:r>
-        <w:t xml:space="preserve"> </w:t>
-      </w:r>
-      <w:proofErr w:type="spellStart"/>
-      <w:r>
-        <w:t>si</w:t>
-      </w:r>
-      <w:proofErr w:type="spellEnd"/>
-      <w:r>
-        <w:t xml:space="preserve"> hay errores</w:t>
+      <w:r>
+        <w:t>Ajustar configuración si hay errores</w:t>
       </w:r>
     </w:p>
     <w:p>
@@ -3535,21 +2506,8 @@
       <w:pPr>
         <w:pStyle w:val="Ttulo2"/>
       </w:pPr>
-      <w:proofErr w:type="spellStart"/>
-      <w:r>
-        <w:t>Verificación</w:t>
-      </w:r>
-      <w:proofErr w:type="spellEnd"/>
-      <w:r>
-        <w:t xml:space="preserve"> de </w:t>
-      </w:r>
-      <w:proofErr w:type="spellStart"/>
-      <w:r>
-        <w:t>Éxito</w:t>
-      </w:r>
-      <w:proofErr w:type="spellEnd"/>
-      <w:r>
-        <w:t>:</w:t>
+      <w:r>
+        <w:t>Verificación de Éxito:</w:t>
       </w:r>
     </w:p>
     <w:p>
@@ -3563,16 +2521,8 @@
         <w:rPr>
           <w:lang w:val="es-CO"/>
         </w:rPr>
-        <w:t xml:space="preserve">Acceder a GitHub.com → Tu repositorio → </w:t>
-      </w:r>
-      <w:proofErr w:type="spellStart"/>
-      <w:r>
-        <w:rPr>
-          <w:lang w:val="es-CO"/>
-        </w:rPr>
-        <w:t>Actions</w:t>
-      </w:r>
-      <w:proofErr w:type="spellEnd"/>
+        <w:t>Acceder a GitHub.com → Tu repositorio → Actions</w:t>
+      </w:r>
     </w:p>
     <w:p>
       <w:pPr>
@@ -3585,35 +2535,7 @@
         <w:rPr>
           <w:lang w:val="es-CO"/>
         </w:rPr>
-        <w:t xml:space="preserve">Debería aparecer un </w:t>
-      </w:r>
-      <w:proofErr w:type="spellStart"/>
-      <w:r>
-        <w:rPr>
-          <w:lang w:val="es-CO"/>
-        </w:rPr>
-        <w:t>workflow</w:t>
-      </w:r>
-      <w:proofErr w:type="spellEnd"/>
-      <w:r>
-        <w:rPr>
-          <w:lang w:val="es-CO"/>
-        </w:rPr>
-        <w:t xml:space="preserve"> ejecutándose o con </w:t>
-      </w:r>
-      <w:proofErr w:type="spellStart"/>
-      <w:r>
-        <w:rPr>
-          <w:lang w:val="es-CO"/>
-        </w:rPr>
-        <w:t>checkmark</w:t>
-      </w:r>
-      <w:proofErr w:type="spellEnd"/>
-      <w:r>
-        <w:rPr>
-          <w:lang w:val="es-CO"/>
-        </w:rPr>
-        <w:t xml:space="preserve"> verde</w:t>
+        <w:t>Debería aparecer un workflow ejecutándose o con checkmark verde</w:t>
       </w:r>
     </w:p>
     <w:p>
@@ -3627,50 +2549,15 @@
         <w:rPr>
           <w:lang w:val="es-CO"/>
         </w:rPr>
-        <w:t xml:space="preserve">Los detalles del </w:t>
-      </w:r>
-      <w:proofErr w:type="spellStart"/>
-      <w:r>
-        <w:rPr>
-          <w:lang w:val="es-CO"/>
-        </w:rPr>
-        <w:t>workflow</w:t>
-      </w:r>
-      <w:proofErr w:type="spellEnd"/>
-      <w:r>
-        <w:rPr>
-          <w:lang w:val="es-CO"/>
-        </w:rPr>
-        <w:t xml:space="preserve"> deben mostrar la ejecución de todos los </w:t>
-      </w:r>
-      <w:proofErr w:type="spellStart"/>
-      <w:r>
-        <w:rPr>
-          <w:lang w:val="es-CO"/>
-        </w:rPr>
-        <w:t>tests</w:t>
-      </w:r>
-      <w:proofErr w:type="spellEnd"/>
+        <w:t>Los detalles del workflow deben mostrar la ejecución de todos los tests</w:t>
+      </w:r>
     </w:p>
     <w:p>
       <w:pPr>
         <w:pStyle w:val="Ttulo2"/>
       </w:pPr>
-      <w:proofErr w:type="spellStart"/>
-      <w:r>
-        <w:t>Evidencia</w:t>
-      </w:r>
-      <w:proofErr w:type="spellEnd"/>
-      <w:r>
-        <w:t xml:space="preserve"> </w:t>
-      </w:r>
-      <w:proofErr w:type="spellStart"/>
-      <w:r>
-        <w:t>Requerida</w:t>
-      </w:r>
-      <w:proofErr w:type="spellEnd"/>
-      <w:r>
-        <w:t>:</w:t>
+      <w:r>
+        <w:t>Evidencia Requerida:</w:t>
       </w:r>
     </w:p>
     <w:p>
@@ -3684,21 +2571,7 @@
         <w:rPr>
           <w:lang w:val="es-CO"/>
         </w:rPr>
-        <w:t xml:space="preserve">Archivo </w:t>
-      </w:r>
-      <w:proofErr w:type="spellStart"/>
-      <w:r>
-        <w:rPr>
-          <w:lang w:val="es-CO"/>
-        </w:rPr>
-        <w:t>ci-pipeline.yml</w:t>
-      </w:r>
-      <w:proofErr w:type="spellEnd"/>
-      <w:r>
-        <w:rPr>
-          <w:lang w:val="es-CO"/>
-        </w:rPr>
-        <w:t xml:space="preserve"> en el repositorio</w:t>
+        <w:t>Archivo ci-pipeline.yml en el repositorio</w:t>
       </w:r>
     </w:p>
     <w:p>
@@ -3712,21 +2585,7 @@
         <w:rPr>
           <w:lang w:val="es-CO"/>
         </w:rPr>
-        <w:t>Captura de pantalla de la pestaña "</w:t>
-      </w:r>
-      <w:proofErr w:type="spellStart"/>
-      <w:r>
-        <w:rPr>
-          <w:lang w:val="es-CO"/>
-        </w:rPr>
-        <w:t>Actions</w:t>
-      </w:r>
-      <w:proofErr w:type="spellEnd"/>
-      <w:r>
-        <w:rPr>
-          <w:lang w:val="es-CO"/>
-        </w:rPr>
-        <w:t>" en GitHub</w:t>
+        <w:t>Captura de pantalla de la pestaña "Actions" en GitHub</w:t>
       </w:r>
     </w:p>
     <w:p>
@@ -3740,48 +2599,15 @@
         <w:rPr>
           <w:lang w:val="es-CO"/>
         </w:rPr>
-        <w:t xml:space="preserve">Captura mostrando un </w:t>
-      </w:r>
-      <w:proofErr w:type="spellStart"/>
-      <w:r>
-        <w:rPr>
-          <w:lang w:val="es-CO"/>
-        </w:rPr>
-        <w:t>workflow</w:t>
-      </w:r>
-      <w:proofErr w:type="spellEnd"/>
-      <w:r>
-        <w:rPr>
-          <w:lang w:val="es-CO"/>
-        </w:rPr>
-        <w:t xml:space="preserve"> exitoso (</w:t>
-      </w:r>
-      <w:proofErr w:type="spellStart"/>
-      <w:r>
-        <w:rPr>
-          <w:lang w:val="es-CO"/>
-        </w:rPr>
-        <w:t>badge</w:t>
-      </w:r>
-      <w:proofErr w:type="spellEnd"/>
-      <w:r>
-        <w:rPr>
-          <w:lang w:val="es-CO"/>
-        </w:rPr>
-        <w:t xml:space="preserve"> verde)</w:t>
+        <w:t>Captura mostrando un workflow exitoso (badge verde)</w:t>
       </w:r>
     </w:p>
     <w:p>
       <w:pPr>
         <w:pStyle w:val="Listaconvietas"/>
       </w:pPr>
-      <w:proofErr w:type="spellStart"/>
-      <w:r>
-        <w:t>Archivo</w:t>
-      </w:r>
-      <w:proofErr w:type="spellEnd"/>
-      <w:r>
-        <w:t xml:space="preserve"> WORKFLOW_DOCUMENTATION.md con:</w:t>
+      <w:r>
+        <w:t>Archivo WORKFLOW_DOCUMENTATION.md con:</w:t>
       </w:r>
     </w:p>
     <w:p>
@@ -3795,16 +2621,8 @@
         <w:rPr>
           <w:lang w:val="es-CO"/>
         </w:rPr>
-        <w:t xml:space="preserve">Explicación de qué es un </w:t>
-      </w:r>
-      <w:proofErr w:type="spellStart"/>
-      <w:r>
-        <w:rPr>
-          <w:lang w:val="es-CO"/>
-        </w:rPr>
-        <w:t>workflow</w:t>
-      </w:r>
-      <w:proofErr w:type="spellEnd"/>
+        <w:t>Explicación de qué es un workflow</w:t>
+      </w:r>
     </w:p>
     <w:p>
       <w:pPr>
@@ -3825,21 +2643,8 @@
         <w:pStyle w:val="Listaconvietas2"/>
       </w:pPr>
       <w:r>
-        <w:t xml:space="preserve">Challenges </w:t>
-      </w:r>
-      <w:proofErr w:type="spellStart"/>
-      <w:r>
-        <w:t>enfrentados</w:t>
-      </w:r>
-      <w:proofErr w:type="spellEnd"/>
-      <w:r>
-        <w:t xml:space="preserve"> y </w:t>
-      </w:r>
-      <w:proofErr w:type="spellStart"/>
-      <w:r>
-        <w:t>soluciones</w:t>
-      </w:r>
-      <w:proofErr w:type="spellEnd"/>
+        <w:t>Challenges enfrentados y soluciones</w:t>
+      </w:r>
     </w:p>
     <w:p>
       <w:r>
@@ -4183,46 +2988,15 @@
         <w:rPr>
           <w:lang w:val="es-CO"/>
         </w:rPr>
-        <w:t xml:space="preserve">Repositorio GitHub con todos los cambios en la rama </w:t>
-      </w:r>
-      <w:proofErr w:type="spellStart"/>
-      <w:r>
-        <w:rPr>
-          <w:lang w:val="es-CO"/>
-        </w:rPr>
-        <w:t>main</w:t>
-      </w:r>
-      <w:proofErr w:type="spellEnd"/>
+        <w:t>Repositorio GitHub con todos los cambios en la rama main</w:t>
+      </w:r>
     </w:p>
     <w:p>
       <w:pPr>
         <w:pStyle w:val="Listaconvietas"/>
       </w:pPr>
-      <w:proofErr w:type="spellStart"/>
-      <w:proofErr w:type="gramStart"/>
-      <w:r>
-        <w:t>Carpeta</w:t>
-      </w:r>
-      <w:proofErr w:type="spellEnd"/>
-      <w:r>
-        <w:t xml:space="preserve"> .</w:t>
-      </w:r>
-      <w:proofErr w:type="spellStart"/>
-      <w:r>
-        <w:t>github</w:t>
-      </w:r>
-      <w:proofErr w:type="spellEnd"/>
-      <w:proofErr w:type="gramEnd"/>
-      <w:r>
-        <w:t xml:space="preserve">/workflows/ con </w:t>
-      </w:r>
-      <w:proofErr w:type="spellStart"/>
-      <w:r>
-        <w:t>archivo</w:t>
-      </w:r>
-      <w:proofErr w:type="spellEnd"/>
-      <w:r>
-        <w:t xml:space="preserve"> ci-pipeline.yml</w:t>
+      <w:r>
+        <w:t>Carpeta .github/workflows/ con archivo ci-pipeline.yml</w:t>
       </w:r>
     </w:p>
     <w:p>
@@ -4250,16 +3024,8 @@
         <w:rPr>
           <w:lang w:val="es-CO"/>
         </w:rPr>
-        <w:t xml:space="preserve">Archivo WORKFLOW_DOCUMENTATION.md con documentación del </w:t>
-      </w:r>
-      <w:proofErr w:type="spellStart"/>
-      <w:r>
-        <w:rPr>
-          <w:lang w:val="es-CO"/>
-        </w:rPr>
-        <w:t>workflow</w:t>
-      </w:r>
-      <w:proofErr w:type="spellEnd"/>
+        <w:t>Archivo WORKFLOW_DOCUMENTATION.md con documentación del workflow</w:t>
+      </w:r>
     </w:p>
     <w:p>
       <w:pPr>
@@ -4295,23 +3061,22 @@
           <w:lang w:val="es-CO"/>
         </w:rPr>
       </w:pPr>
-      <w:proofErr w:type="spellStart"/>
       <w:r>
         <w:rPr>
           <w:rFonts w:ascii="Courier New" w:hAnsi="Courier New"/>
           <w:sz w:val="18"/>
           <w:lang w:val="es-CO"/>
         </w:rPr>
-        <w:t>proyectoEquipos</w:t>
-      </w:r>
-      <w:proofErr w:type="spellEnd"/>
+        <w:t>proyectoEquipos/</w:t>
+      </w:r>
       <w:r>
         <w:rPr>
           <w:rFonts w:ascii="Courier New" w:hAnsi="Courier New"/>
           <w:sz w:val="18"/>
           <w:lang w:val="es-CO"/>
         </w:rPr>
-        <w:t>/</w:t>
+        <w:br/>
+        <w:t>├── .github/workflows/</w:t>
       </w:r>
       <w:r>
         <w:rPr>
@@ -4320,43 +3085,43 @@
           <w:lang w:val="es-CO"/>
         </w:rPr>
         <w:br/>
-        <w:t>├── .</w:t>
-      </w:r>
-      <w:proofErr w:type="spellStart"/>
+        <w:t>│   └── ci-pipeline.yml</w:t>
+      </w:r>
       <w:r>
         <w:rPr>
           <w:rFonts w:ascii="Courier New" w:hAnsi="Courier New"/>
           <w:sz w:val="18"/>
           <w:lang w:val="es-CO"/>
         </w:rPr>
-        <w:t>github</w:t>
-      </w:r>
-      <w:proofErr w:type="spellEnd"/>
+        <w:br/>
+        <w:t>├── principal/</w:t>
+      </w:r>
       <w:r>
         <w:rPr>
           <w:rFonts w:ascii="Courier New" w:hAnsi="Courier New"/>
           <w:sz w:val="18"/>
           <w:lang w:val="es-CO"/>
         </w:rPr>
-        <w:t>/</w:t>
-      </w:r>
-      <w:proofErr w:type="spellStart"/>
+        <w:br/>
+        <w:t>│   ├── users/tests.py (modificado)</w:t>
+      </w:r>
       <w:r>
         <w:rPr>
           <w:rFonts w:ascii="Courier New" w:hAnsi="Courier New"/>
           <w:sz w:val="18"/>
           <w:lang w:val="es-CO"/>
         </w:rPr>
-        <w:t>workflows</w:t>
-      </w:r>
-      <w:proofErr w:type="spellEnd"/>
+        <w:br/>
+        <w:t>│   ├── categories/tests.py (modificado)</w:t>
+      </w:r>
       <w:r>
         <w:rPr>
           <w:rFonts w:ascii="Courier New" w:hAnsi="Courier New"/>
           <w:sz w:val="18"/>
           <w:lang w:val="es-CO"/>
         </w:rPr>
-        <w:t>/</w:t>
+        <w:br/>
+        <w:t>│   ├── mantenimiento/tests.py (modificado)</w:t>
       </w:r>
       <w:r>
         <w:rPr>
@@ -4365,18 +3130,17 @@
           <w:lang w:val="es-CO"/>
         </w:rPr>
         <w:br/>
-        <w:t xml:space="preserve">│   └── </w:t>
-      </w:r>
-      <w:proofErr w:type="spellStart"/>
+        <w:t>│   └── ...</w:t>
+      </w:r>
       <w:r>
         <w:rPr>
           <w:rFonts w:ascii="Courier New" w:hAnsi="Courier New"/>
           <w:sz w:val="18"/>
           <w:lang w:val="es-CO"/>
         </w:rPr>
-        <w:t>ci-pipeline.yml</w:t>
-      </w:r>
-      <w:proofErr w:type="spellEnd"/>
+        <w:br/>
+        <w:t>├── evidencias/</w:t>
+      </w:r>
       <w:r>
         <w:rPr>
           <w:rFonts w:ascii="Courier New" w:hAnsi="Courier New"/>
@@ -4384,7 +3148,7 @@
           <w:lang w:val="es-CO"/>
         </w:rPr>
         <w:br/>
-        <w:t>├── principal/</w:t>
+        <w:t>│   ├── 01_setup.png</w:t>
       </w:r>
       <w:r>
         <w:rPr>
@@ -4393,7 +3157,7 @@
           <w:lang w:val="es-CO"/>
         </w:rPr>
         <w:br/>
-        <w:t>│   ├── users/tests.py (modificado)</w:t>
+        <w:t>│   ├── 02_tests_all.png</w:t>
       </w:r>
       <w:r>
         <w:rPr>
@@ -4402,7 +3166,7 @@
           <w:lang w:val="es-CO"/>
         </w:rPr>
         <w:br/>
-        <w:t>│   ├── categories/tests.py (modificado)</w:t>
+        <w:t>│   ├── 03_tests_users.png</w:t>
       </w:r>
       <w:r>
         <w:rPr>
@@ -4411,7 +3175,7 @@
           <w:lang w:val="es-CO"/>
         </w:rPr>
         <w:br/>
-        <w:t>│   ├── mantenimiento/tests.py (modificado)</w:t>
+        <w:t>│   ├── 04_tests_categories.png</w:t>
       </w:r>
       <w:r>
         <w:rPr>
@@ -4420,7 +3184,7 @@
           <w:lang w:val="es-CO"/>
         </w:rPr>
         <w:br/>
-        <w:t>│   └── ...</w:t>
+        <w:t>│   ├── 05_tests_mantenimiento.png</w:t>
       </w:r>
       <w:r>
         <w:rPr>
@@ -4429,7 +3193,7 @@
           <w:lang w:val="es-CO"/>
         </w:rPr>
         <w:br/>
-        <w:t>├── evidencias/</w:t>
+        <w:t>│   ├── 06_pruebas_pasando.png</w:t>
       </w:r>
       <w:r>
         <w:rPr>
@@ -4438,7 +3202,7 @@
           <w:lang w:val="es-CO"/>
         </w:rPr>
         <w:br/>
-        <w:t>│   ├── 01_setup.png</w:t>
+        <w:t>│   └── 07_github_actions.png</w:t>
       </w:r>
       <w:r>
         <w:rPr>
@@ -4447,7 +3211,7 @@
           <w:lang w:val="es-CO"/>
         </w:rPr>
         <w:br/>
-        <w:t>│   ├── 02_tests_all.png</w:t>
+        <w:t>├── CORRECCIONES.md</w:t>
       </w:r>
       <w:r>
         <w:rPr>
@@ -4456,60 +3220,6 @@
           <w:lang w:val="es-CO"/>
         </w:rPr>
         <w:br/>
-        <w:t>│   ├── 03_tests_users.png</w:t>
-      </w:r>
-      <w:r>
-        <w:rPr>
-          <w:rFonts w:ascii="Courier New" w:hAnsi="Courier New"/>
-          <w:sz w:val="18"/>
-          <w:lang w:val="es-CO"/>
-        </w:rPr>
-        <w:br/>
-        <w:t>│   ├── 04_tests_categories.png</w:t>
-      </w:r>
-      <w:r>
-        <w:rPr>
-          <w:rFonts w:ascii="Courier New" w:hAnsi="Courier New"/>
-          <w:sz w:val="18"/>
-          <w:lang w:val="es-CO"/>
-        </w:rPr>
-        <w:br/>
-        <w:t>│   ├── 05_tests_mantenimiento.png</w:t>
-      </w:r>
-      <w:r>
-        <w:rPr>
-          <w:rFonts w:ascii="Courier New" w:hAnsi="Courier New"/>
-          <w:sz w:val="18"/>
-          <w:lang w:val="es-CO"/>
-        </w:rPr>
-        <w:br/>
-        <w:t>│   ├── 06_pruebas_pasando.png</w:t>
-      </w:r>
-      <w:r>
-        <w:rPr>
-          <w:rFonts w:ascii="Courier New" w:hAnsi="Courier New"/>
-          <w:sz w:val="18"/>
-          <w:lang w:val="es-CO"/>
-        </w:rPr>
-        <w:br/>
-        <w:t>│   └── 07_github_actions.png</w:t>
-      </w:r>
-      <w:r>
-        <w:rPr>
-          <w:rFonts w:ascii="Courier New" w:hAnsi="Courier New"/>
-          <w:sz w:val="18"/>
-          <w:lang w:val="es-CO"/>
-        </w:rPr>
-        <w:br/>
-        <w:t>├── CORRECCIONES.md</w:t>
-      </w:r>
-      <w:r>
-        <w:rPr>
-          <w:rFonts w:ascii="Courier New" w:hAnsi="Courier New"/>
-          <w:sz w:val="18"/>
-          <w:lang w:val="es-CO"/>
-        </w:rPr>
-        <w:br/>
         <w:t>└── WORKFLOW_DOCUMENTATION.md</w:t>
       </w:r>
     </w:p>
@@ -4568,16 +3278,8 @@
         <w:rPr>
           <w:lang w:val="es-CO"/>
         </w:rPr>
-        <w:t xml:space="preserve">TESTING.md: Descripción detallada de la estrategia de </w:t>
-      </w:r>
-      <w:proofErr w:type="spellStart"/>
-      <w:r>
-        <w:rPr>
-          <w:lang w:val="es-CO"/>
-        </w:rPr>
-        <w:t>testing</w:t>
-      </w:r>
-      <w:proofErr w:type="spellEnd"/>
+        <w:t>TESTING.md: Descripción detallada de la estrategia de testing</w:t>
+      </w:r>
     </w:p>
     <w:p>
       <w:pPr>
@@ -4590,21 +3292,7 @@
         <w:rPr>
           <w:lang w:val="es-CO"/>
         </w:rPr>
-        <w:t xml:space="preserve">README_PRUEBAS.md: Quick </w:t>
-      </w:r>
-      <w:proofErr w:type="spellStart"/>
-      <w:r>
-        <w:rPr>
-          <w:lang w:val="es-CO"/>
-        </w:rPr>
-        <w:t>start</w:t>
-      </w:r>
-      <w:proofErr w:type="spellEnd"/>
-      <w:r>
-        <w:rPr>
-          <w:lang w:val="es-CO"/>
-        </w:rPr>
-        <w:t xml:space="preserve"> para pruebas</w:t>
+        <w:t>README_PRUEBAS.md: Quick start para pruebas</w:t>
       </w:r>
     </w:p>
     <w:p>
@@ -4626,15 +3314,7 @@
         <w:pStyle w:val="Ttulo2"/>
       </w:pPr>
       <w:r>
-        <w:t xml:space="preserve">Enlaces de </w:t>
-      </w:r>
-      <w:proofErr w:type="spellStart"/>
-      <w:r>
-        <w:t>Referencia</w:t>
-      </w:r>
-      <w:proofErr w:type="spellEnd"/>
-      <w:r>
-        <w:t>:</w:t>
+        <w:t>Enlaces de Referencia:</w:t>
       </w:r>
     </w:p>
     <w:p>
@@ -4696,13 +3376,8 @@
         <w:pStyle w:val="Listaconvietas"/>
       </w:pPr>
       <w:r>
-        <w:t xml:space="preserve">Git/GitHub Desktop para </w:t>
-      </w:r>
-      <w:proofErr w:type="spellStart"/>
-      <w:r>
-        <w:t>versionado</w:t>
-      </w:r>
-      <w:proofErr w:type="spellEnd"/>
+        <w:t>Git/GitHub Desktop para versionado</w:t>
+      </w:r>
     </w:p>
     <w:p>
       <w:pPr>
@@ -4715,21 +3390,7 @@
         <w:rPr>
           <w:lang w:val="es-CO"/>
         </w:rPr>
-        <w:t xml:space="preserve">Postman o similar para probar </w:t>
-      </w:r>
-      <w:proofErr w:type="spellStart"/>
-      <w:r>
-        <w:rPr>
-          <w:lang w:val="es-CO"/>
-        </w:rPr>
-        <w:t>APIs</w:t>
-      </w:r>
-      <w:proofErr w:type="spellEnd"/>
-      <w:r>
-        <w:rPr>
-          <w:lang w:val="es-CO"/>
-        </w:rPr>
-        <w:t xml:space="preserve"> (opcional)</w:t>
+        <w:t>Postman o similar para probar APIs (opcional)</w:t>
       </w:r>
     </w:p>
     <w:p>
@@ -4784,21 +3445,7 @@
         <w:rPr>
           <w:lang w:val="es-CO"/>
         </w:rPr>
-        <w:t xml:space="preserve">Esta actividad simula un flujo real de desarrollo de software. Aprenderán no solo sobre pruebas y automatización, sino también sobre buenas prácticas en </w:t>
-      </w:r>
-      <w:proofErr w:type="spellStart"/>
-      <w:r>
-        <w:rPr>
-          <w:lang w:val="es-CO"/>
-        </w:rPr>
-        <w:t>versioning</w:t>
-      </w:r>
-      <w:proofErr w:type="spellEnd"/>
-      <w:r>
-        <w:rPr>
-          <w:lang w:val="es-CO"/>
-        </w:rPr>
-        <w:t>, documentación y CI/CD.</w:t>
+        <w:t>Esta actividad simula un flujo real de desarrollo de software. Aprenderán no solo sobre pruebas y automatización, sino también sobre buenas prácticas en versioning, documentación y CI/CD.</w:t>
       </w:r>
     </w:p>
     <w:p>
@@ -4813,15 +3460,7 @@
         <w:pStyle w:val="Listaconvietas"/>
       </w:pPr>
       <w:r>
-        <w:t xml:space="preserve">No dude </w:t>
-      </w:r>
-      <w:proofErr w:type="spellStart"/>
-      <w:r>
-        <w:t>en</w:t>
-      </w:r>
-      <w:proofErr w:type="spellEnd"/>
-      <w:r>
-        <w:t>:</w:t>
+        <w:t>No dude en:</w:t>
       </w:r>
     </w:p>
     <w:p>
@@ -4835,16 +3474,8 @@
         <w:rPr>
           <w:lang w:val="es-CO"/>
         </w:rPr>
-        <w:t xml:space="preserve">Experimentar con diferentes configuraciones en el </w:t>
-      </w:r>
-      <w:proofErr w:type="spellStart"/>
-      <w:r>
-        <w:rPr>
-          <w:lang w:val="es-CO"/>
-        </w:rPr>
-        <w:t>workflow</w:t>
-      </w:r>
-      <w:proofErr w:type="spellEnd"/>
+        <w:t>Experimentar con diferentes configuraciones en el workflow</w:t>
+      </w:r>
     </w:p>
     <w:p>
       <w:pPr>
@@ -4857,21 +3488,7 @@
         <w:rPr>
           <w:lang w:val="es-CO"/>
         </w:rPr>
-        <w:t xml:space="preserve">Leer los logs de error en GitHub </w:t>
-      </w:r>
-      <w:proofErr w:type="spellStart"/>
-      <w:r>
-        <w:rPr>
-          <w:lang w:val="es-CO"/>
-        </w:rPr>
-        <w:t>Actions</w:t>
-      </w:r>
-      <w:proofErr w:type="spellEnd"/>
-      <w:r>
-        <w:rPr>
-          <w:lang w:val="es-CO"/>
-        </w:rPr>
-        <w:t xml:space="preserve"> detalladamente</w:t>
+        <w:t>Leer los logs de error en GitHub Actions detalladamente</w:t>
       </w:r>
     </w:p>
     <w:p>
@@ -4913,13 +3530,8 @@
       <w:pPr>
         <w:pStyle w:val="Listaconvietas"/>
       </w:pPr>
-      <w:proofErr w:type="spellStart"/>
-      <w:r>
-        <w:t>Recuerde</w:t>
-      </w:r>
-      <w:proofErr w:type="spellEnd"/>
-      <w:r>
-        <w:t>:</w:t>
+      <w:r>
+        <w:t>Recuerde:</w:t>
       </w:r>
     </w:p>
     <w:p>
@@ -4975,7 +3587,7 @@
 </file>
 
 <file path=word/numbering.xml><?xml version="1.0" encoding="utf-8"?>
-<w:numbering xmlns:wpc="http://schemas.microsoft.com/office/word/2010/wordprocessingCanvas" xmlns:cx="http://schemas.microsoft.com/office/drawing/2014/chartex" xmlns:cx1="http://schemas.microsoft.com/office/drawing/2015/9/8/chartex" xmlns:cx2="http://schemas.microsoft.com/office/drawing/2015/10/21/chartex" xmlns:cx3="http://schemas.microsoft.com/office/drawing/2016/5/9/chartex" xmlns:cx4="http://schemas.microsoft.com/office/drawing/2016/5/10/chartex" xmlns:cx5="http://schemas.microsoft.com/office/drawing/2016/5/11/chartex" xmlns:cx6="http://schemas.microsoft.com/office/drawing/2016/5/12/chartex" xmlns:cx7="http://schemas.microsoft.com/office/drawing/2016/5/13/chartex" xmlns:cx8="http://schemas.microsoft.com/office/drawing/2016/5/14/chartex" xmlns:mc="http://schemas.openxmlformats.org/markup-compatibility/2006" xmlns:m="http://schemas.openxmlformats.org/officeDocument/2006/math" xmlns:aink="http://schemas.microsoft.com/office/drawing/2016/ink" xmlns:am3d="http://schemas.microsoft.com/office/drawing/2017/model3d" xmlns:oel="http://schemas.microsoft.com/office/2019/extlst" xmlns:r="http://schemas.openxmlformats.org/officeDocument/2006/relationships" xmlns:wp14="http://schemas.microsoft.com/office/word/2010/wordprocessingDrawing" xmlns:wp="http://schemas.openxmlformats.org/drawingml/2006/wordprocessingDrawing" xmlns:wpg="http://schemas.microsoft.com/office/word/2010/wordprocessingGroup" xmlns:wpi="http://schemas.microsoft.com/office/word/2010/wordprocessingInk" xmlns:wps="http://schemas.microsoft.com/office/word/2010/wordprocessingShape" xmlns:o="urn:schemas-microsoft-com:office:office" xmlns:v="urn:schemas-microsoft-com:vml" xmlns:w10="urn:schemas-microsoft-com:office:word" xmlns:w="http://schemas.openxmlformats.org/wordprocessingml/2006/main" xmlns:w14="http://schemas.microsoft.com/office/word/2010/wordml" xmlns:w15="http://schemas.microsoft.com/office/word/2012/wordml" xmlns:w16cex="http://schemas.microsoft.com/office/word/2018/wordml/cex" xmlns:w16cid="http://schemas.microsoft.com/office/word/2016/wordml/cid" xmlns:w16="http://schemas.microsoft.com/office/word/2018/wordml" xmlns:w16sdtdh="http://schemas.microsoft.com/office/word/2020/wordml/sdtdatahash" xmlns:w16sdtfl="http://schemas.microsoft.com/office/word/2024/wordml/sdtformatlock" xmlns:w16se="http://schemas.microsoft.com/office/word/2015/wordml/symex" xmlns:w16du="http://schemas.microsoft.com/office/word/2023/wordml/word16du" xmlns:wne="http://schemas.microsoft.com/office/word/2006/wordml" mc:Ignorable="w14 w15 w16se w16cid w16 w16cex w16sdtdh w16sdtfl w16du wp14">
+<w:numbering xmlns:wpc="http://schemas.microsoft.com/office/word/2010/wordprocessingCanvas" xmlns:cx="http://schemas.microsoft.com/office/drawing/2014/chartex" xmlns:cx1="http://schemas.microsoft.com/office/drawing/2015/9/8/chartex" xmlns:cx2="http://schemas.microsoft.com/office/drawing/2015/10/21/chartex" xmlns:cx3="http://schemas.microsoft.com/office/drawing/2016/5/9/chartex" xmlns:cx4="http://schemas.microsoft.com/office/drawing/2016/5/10/chartex" xmlns:cx5="http://schemas.microsoft.com/office/drawing/2016/5/11/chartex" xmlns:cx6="http://schemas.microsoft.com/office/drawing/2016/5/12/chartex" xmlns:cx7="http://schemas.microsoft.com/office/drawing/2016/5/13/chartex" xmlns:cx8="http://schemas.microsoft.com/office/drawing/2016/5/14/chartex" xmlns:mc="http://schemas.openxmlformats.org/markup-compatibility/2006" xmlns:aink="http://schemas.microsoft.com/office/drawing/2016/ink" xmlns:am3d="http://schemas.microsoft.com/office/drawing/2017/model3d" xmlns:o="urn:schemas-microsoft-com:office:office" xmlns:oel="http://schemas.microsoft.com/office/2019/extlst" xmlns:r="http://schemas.openxmlformats.org/officeDocument/2006/relationships" xmlns:m="http://schemas.openxmlformats.org/officeDocument/2006/math" xmlns:v="urn:schemas-microsoft-com:vml" xmlns:wp14="http://schemas.microsoft.com/office/word/2010/wordprocessingDrawing" xmlns:wp="http://schemas.openxmlformats.org/drawingml/2006/wordprocessingDrawing" xmlns:w10="urn:schemas-microsoft-com:office:word" xmlns:w="http://schemas.openxmlformats.org/wordprocessingml/2006/main" xmlns:w14="http://schemas.microsoft.com/office/word/2010/wordml" xmlns:w15="http://schemas.microsoft.com/office/word/2012/wordml" xmlns:w16cex="http://schemas.microsoft.com/office/word/2018/wordml/cex" xmlns:w16cid="http://schemas.microsoft.com/office/word/2016/wordml/cid" xmlns:w16="http://schemas.microsoft.com/office/word/2018/wordml" xmlns:w16du="http://schemas.microsoft.com/office/word/2023/wordml/word16du" xmlns:w16sdtdh="http://schemas.microsoft.com/office/word/2020/wordml/sdtdatahash" xmlns:w16sdtfl="http://schemas.microsoft.com/office/word/2024/wordml/sdtformatlock" xmlns:w16se="http://schemas.microsoft.com/office/word/2015/wordml/symex" xmlns:wpg="http://schemas.microsoft.com/office/word/2010/wordprocessingGroup" xmlns:wpi="http://schemas.microsoft.com/office/word/2010/wordprocessingInk" xmlns:wne="http://schemas.microsoft.com/office/word/2006/wordml" xmlns:wps="http://schemas.microsoft.com/office/word/2010/wordprocessingShape" mc:Ignorable="w14 w15 w16se w16cid w16 w16cex w16sdtdh w16sdtfl w16du wp14">
   <w:abstractNum w:abstractNumId="0" w15:restartNumberingAfterBreak="0">
     <w:nsid w:val="FFFFFF7C"/>
     <w:multiLevelType w:val="singleLevel"/>
@@ -5090,7 +3702,7 @@
   <w:abstractNum w:abstractNumId="6" w15:restartNumberingAfterBreak="0">
     <w:nsid w:val="FFFFFF83"/>
     <w:multiLevelType w:val="singleLevel"/>
-    <w:tmpl w:val="3D1EFFD4"/>
+    <w:tmpl w:val="077A4D34"/>
     <w:lvl w:ilvl="0">
       <w:start w:val="1"/>
       <w:numFmt w:val="bullet"/>
@@ -5111,7 +3723,7 @@
   <w:abstractNum w:abstractNumId="7" w15:restartNumberingAfterBreak="0">
     <w:nsid w:val="FFFFFF88"/>
     <w:multiLevelType w:val="singleLevel"/>
-    <w:tmpl w:val="D0A62B40"/>
+    <w:tmpl w:val="918A0594"/>
     <w:lvl w:ilvl="0">
       <w:start w:val="1"/>
       <w:numFmt w:val="decimal"/>
@@ -5129,7 +3741,7 @@
   <w:abstractNum w:abstractNumId="8" w15:restartNumberingAfterBreak="0">
     <w:nsid w:val="FFFFFF89"/>
     <w:multiLevelType w:val="singleLevel"/>
-    <w:tmpl w:val="29761A62"/>
+    <w:tmpl w:val="70D64316"/>
     <w:lvl w:ilvl="0">
       <w:start w:val="1"/>
       <w:numFmt w:val="bullet"/>
@@ -5174,11 +3786,14 @@
   <w:num w:numId="9" w16cid:durableId="189685730">
     <w:abstractNumId w:val="0"/>
   </w:num>
+  <w:num w:numId="10" w16cid:durableId="1729456867">
+    <w:abstractNumId w:val="7"/>
+  </w:num>
 </w:numbering>
 </file>
 
 <file path=word/styles.xml><?xml version="1.0" encoding="utf-8"?>
-<w:styles xmlns:mc="http://schemas.openxmlformats.org/markup-compatibility/2006" xmlns:r="http://schemas.openxmlformats.org/officeDocument/2006/relationships" xmlns:w="http://schemas.openxmlformats.org/wordprocessingml/2006/main" xmlns:w14="http://schemas.microsoft.com/office/word/2010/wordml" xmlns:w15="http://schemas.microsoft.com/office/word/2012/wordml" xmlns:w16cex="http://schemas.microsoft.com/office/word/2018/wordml/cex" xmlns:w16cid="http://schemas.microsoft.com/office/word/2016/wordml/cid" xmlns:w16="http://schemas.microsoft.com/office/word/2018/wordml" xmlns:w16sdtdh="http://schemas.microsoft.com/office/word/2020/wordml/sdtdatahash" xmlns:w16sdtfl="http://schemas.microsoft.com/office/word/2024/wordml/sdtformatlock" xmlns:w16se="http://schemas.microsoft.com/office/word/2015/wordml/symex" xmlns:w16du="http://schemas.microsoft.com/office/word/2023/wordml/word16du" mc:Ignorable="w14 w15 w16se w16cid w16 w16cex w16sdtdh w16sdtfl w16du">
+<w:styles xmlns:mc="http://schemas.openxmlformats.org/markup-compatibility/2006" xmlns:r="http://schemas.openxmlformats.org/officeDocument/2006/relationships" xmlns:w="http://schemas.openxmlformats.org/wordprocessingml/2006/main" xmlns:w14="http://schemas.microsoft.com/office/word/2010/wordml" xmlns:w15="http://schemas.microsoft.com/office/word/2012/wordml" xmlns:w16cex="http://schemas.microsoft.com/office/word/2018/wordml/cex" xmlns:w16cid="http://schemas.microsoft.com/office/word/2016/wordml/cid" xmlns:w16="http://schemas.microsoft.com/office/word/2018/wordml" xmlns:w16du="http://schemas.microsoft.com/office/word/2023/wordml/word16du" xmlns:w16sdtdh="http://schemas.microsoft.com/office/word/2020/wordml/sdtdatahash" xmlns:w16sdtfl="http://schemas.microsoft.com/office/word/2024/wordml/sdtformatlock" xmlns:w16se="http://schemas.microsoft.com/office/word/2015/wordml/symex" mc:Ignorable="w14 w15 w16se w16cid w16 w16cex w16sdtdh w16sdtfl w16du">
   <w:docDefaults>
     <w:rPrDefault>
       <w:rPr>

</xml_diff>